<commit_message>
feat: soporte integral de 15280 predios catastrales, arquitectura movil PWA y catalogo de skills especializadas
</commit_message>
<xml_diff>
--- a/04_Documentacion/VisorDatosSIG_Documento_Tecnico_Oficial.docx
+++ b/04_Documentacion/VisorDatosSIG_Documento_Tecnico_Oficial.docx
@@ -925,6 +925,19 @@
           <w:color w:val="282D23"/>
           <w:sz w:val="19"/>
         </w:rPr>
+        <w:t xml:space="preserve">   4.4 Cobertura Catastral Total: Diagnóstico de 15,280 Predios y Terrenos Baldíos</w:t>
+      </w:r>
+    </w:p>
+    <w:p>
+      <w:pPr>
+        <w:spacing w:after="40"/>
+      </w:pPr>
+      <w:r>
+        <w:rPr>
+          <w:rFonts w:ascii="Segoe UI" w:hAnsi="Segoe UI"/>
+          <w:color w:val="282D23"/>
+          <w:sz w:val="19"/>
+        </w:rPr>
         <w:t>5. Arquitectura de Software en Capas Limpias (.NET 8.0 C#)</w:t>
       </w:r>
     </w:p>
@@ -964,7 +977,7 @@
           <w:color w:val="282D23"/>
           <w:sz w:val="19"/>
         </w:rPr>
-        <w:t>8. Diseño de la Interfaz de Usuario y Experiencia de Operación (UIX)</w:t>
+        <w:t>8. Diseño de Interfaz (UIX), Arquitectura Móvil PWA y Geolocalización (Anexo F.7)</w:t>
       </w:r>
     </w:p>
     <w:p>
@@ -990,7 +1003,7 @@
           <w:color w:val="282D23"/>
           <w:sz w:val="19"/>
         </w:rPr>
-        <w:t>10. Guía de Instalación, Configuración y Despliegue Local</w:t>
+        <w:t>10. Catálogo y Selección de Agent Skills para Optimización del Proyecto</w:t>
       </w:r>
     </w:p>
     <w:p>
@@ -1003,7 +1016,20 @@
           <w:color w:val="282D23"/>
           <w:sz w:val="19"/>
         </w:rPr>
-        <w:t>11. Conclusiones y Trabajo Futuro</w:t>
+        <w:t>11. Guía de Instalación, Configuración y Despliegue Local</w:t>
+      </w:r>
+    </w:p>
+    <w:p>
+      <w:pPr>
+        <w:spacing w:after="40"/>
+      </w:pPr>
+      <w:r>
+        <w:rPr>
+          <w:rFonts w:ascii="Segoe UI" w:hAnsi="Segoe UI"/>
+          <w:color w:val="282D23"/>
+          <w:sz w:val="19"/>
+        </w:rPr>
+        <w:t>12. Conclusiones y Trabajo Futuro</w:t>
       </w:r>
     </w:p>
     <w:p>
@@ -4721,6 +4747,653 @@
     <w:p>
       <w:pPr>
         <w:keepNext/>
+        <w:spacing w:before="240" w:after="80"/>
+      </w:pPr>
+      <w:r>
+        <w:rPr>
+          <w:rFonts w:ascii="Segoe UI" w:hAnsi="Segoe UI"/>
+          <w:b/>
+          <w:color w:val="2E4636"/>
+          <w:sz w:val="25"/>
+        </w:rPr>
+        <w:t>Cobertura Catastral Total: Diagnóstico de 15,280 Predios y Terrenos Baldíos</w:t>
+      </w:r>
+    </w:p>
+    <w:p>
+      <w:pPr>
+        <w:spacing w:after="100" w:line="276" w:lineRule="auto"/>
+      </w:pPr>
+      <w:r>
+        <w:rPr>
+          <w:rFonts w:ascii="Segoe UI" w:hAnsi="Segoe UI"/>
+          <w:i w:val="0"/>
+          <w:color w:val="2D302A"/>
+          <w:sz w:val="20"/>
+        </w:rPr>
+        <w:t>Durante las pruebas de verificación territorial y cotejo de campo, se detectó una aparente discrepancia: las consultas temáticas previas arrojaban alrededor de 3,000 registros, a pesar de que el catastro urbano de San Ignacio de Velasco cuenta con 15,280 lotes delimitados. El diagnóstico técnico de la base de datos reveló la causa fundamental y motivó una reingeniería del modelo de consulta:</w:t>
+      </w:r>
+    </w:p>
+    <w:p>
+      <w:pPr>
+        <w:pStyle w:val="ListBullet"/>
+        <w:spacing w:after="60" w:line="269" w:lineRule="auto"/>
+      </w:pPr>
+      <w:r>
+        <w:rPr>
+          <w:rFonts w:ascii="Segoe UI" w:hAnsi="Segoe UI"/>
+          <w:b/>
+          <w:color w:val="23281E"/>
+          <w:sz w:val="19"/>
+        </w:rPr>
+        <w:t xml:space="preserve">Causa Raíz en el Modelo Relacional: </w:t>
+      </w:r>
+      <w:r>
+        <w:rPr>
+          <w:rFonts w:ascii="Segoe UI" w:hAnsi="Segoe UI"/>
+          <w:color w:val="2D302A"/>
+          <w:sz w:val="19"/>
+        </w:rPr>
+        <w:t>La tabla dbo.CodigosFijos contiene 6,271 puntos de medición eléctrica vinculados espacialmente a 3,947 polígonos de lote (debido a predios con múltiples medidores o conexiones compartidas). Las consultas basadas exclusivamente en dbo.CodigosFijos omitían por completo los 11,333 terrenos baldíos o parcelas sin medidor activo instalado.</w:t>
+      </w:r>
+    </w:p>
+    <w:p>
+      <w:pPr>
+        <w:pStyle w:val="ListBullet"/>
+        <w:spacing w:after="60" w:line="269" w:lineRule="auto"/>
+      </w:pPr>
+      <w:r>
+        <w:rPr>
+          <w:rFonts w:ascii="Segoe UI" w:hAnsi="Segoe UI"/>
+          <w:b/>
+          <w:color w:val="23281E"/>
+          <w:sz w:val="19"/>
+        </w:rPr>
+        <w:t xml:space="preserve">Precomputación de Centroides Espaciales: </w:t>
+      </w:r>
+      <w:r>
+        <w:rPr>
+          <w:rFonts w:ascii="Segoe UI" w:hAnsi="Segoe UI"/>
+          <w:color w:val="2D302A"/>
+          <w:sz w:val="19"/>
+        </w:rPr>
+        <w:t>Se añadieron formalmente las columnas 'Latitud FLOAT' y 'Longitud FLOAT' directamente en la tabla dbo.Lotes y se precalcularon sus coordenadas geográficas mediante la función OGC Lote.Geom.STCentroid() para los 15,280 polígonos catastrales, permitiendo la georreferenciación instantánea de cualquier predio sin sobrecargar la CPU del servidor al vuelo.</w:t>
+      </w:r>
+    </w:p>
+    <w:p>
+      <w:pPr>
+        <w:pStyle w:val="ListBullet"/>
+        <w:spacing w:after="60" w:line="269" w:lineRule="auto"/>
+      </w:pPr>
+      <w:r>
+        <w:rPr>
+          <w:rFonts w:ascii="Segoe UI" w:hAnsi="Segoe UI"/>
+          <w:b/>
+          <w:color w:val="23281E"/>
+          <w:sz w:val="19"/>
+        </w:rPr>
+        <w:t xml:space="preserve">Procedimiento Almacenado Unificado de Cobertura Total: </w:t>
+      </w:r>
+      <w:r>
+        <w:rPr>
+          <w:rFonts w:ascii="Segoe UI" w:hAnsi="Segoe UI"/>
+          <w:color w:val="2D302A"/>
+          <w:sz w:val="19"/>
+        </w:rPr>
+        <w:t>Se construyó el procedimiento almacenado unificado dbo.sp_BuscarPrediosTotal y se actualizó dbo.sp_BuscarInmueble con el parámetro @TipoSuministro ('TODOS', 'CON_SUMINISTRO', 'SIN_SUMINISTRO'). Esto permite al usuario explorar tanto los 5,118 registros con medidor como los 11,333 lotes baldíos, o el universo consolidado de 16,451 relaciones prediales.</w:t>
+      </w:r>
+    </w:p>
+    <w:p>
+      <w:pPr>
+        <w:pStyle w:val="ListBullet"/>
+        <w:spacing w:after="60" w:line="269" w:lineRule="auto"/>
+      </w:pPr>
+      <w:r>
+        <w:rPr>
+          <w:rFonts w:ascii="Segoe UI" w:hAnsi="Segoe UI"/>
+          <w:b/>
+          <w:color w:val="23281E"/>
+          <w:sz w:val="19"/>
+        </w:rPr>
+        <w:t xml:space="preserve">Rendimiento Sub-Segundo Verificado: </w:t>
+      </w:r>
+      <w:r>
+        <w:rPr>
+          <w:rFonts w:ascii="Segoe UI" w:hAnsi="Segoe UI"/>
+          <w:color w:val="2D302A"/>
+          <w:sz w:val="19"/>
+        </w:rPr>
+        <w:t>El tiempo de respuesta se mantiene en rango de ultra-alto rendimiento: 0.335 segundos para consultar los 16,451 registros completos, 0.172 segundos para los 11,333 baldíos y 0.092 segundos para los predios con suministro, garantizando una experiencia de usuario fluida.</w:t>
+      </w:r>
+    </w:p>
+    <w:tbl>
+      <w:tblPr>
+        <w:tblW w:type="auto" w:w="0"/>
+        <w:jc w:val="center"/>
+        <w:tblLook w:firstColumn="1" w:firstRow="1" w:lastColumn="0" w:lastRow="0" w:noHBand="0" w:noVBand="1" w:val="04A0"/>
+      </w:tblPr>
+      <w:tblGrid>
+        <w:gridCol w:w="2340"/>
+        <w:gridCol w:w="2340"/>
+        <w:gridCol w:w="2340"/>
+        <w:gridCol w:w="2340"/>
+      </w:tblGrid>
+      <w:tr>
+        <w:tc>
+          <w:tcPr>
+            <w:tcW w:type="dxa" w:w="2592"/>
+            <w:shd w:fill="2E4636"/>
+            <w:tcMar>
+              <w:top w:w="80" w:type="dxa"/>
+              <w:bottom w:w="80" w:type="dxa"/>
+              <w:left w:w="120" w:type="dxa"/>
+              <w:right w:w="120" w:type="dxa"/>
+            </w:tcMar>
+            <w:tcBorders>
+              <w:top w:val="single" w:sz="4" w:space="0" w:color="24382B"/>
+              <w:bottom w:val="single" w:sz="4" w:space="0" w:color="24382B"/>
+              <w:left w:val="single" w:sz="4" w:space="0" w:color="24382B"/>
+              <w:right w:val="single" w:sz="4" w:space="0" w:color="24382B"/>
+            </w:tcBorders>
+          </w:tcPr>
+          <w:p>
+            <w:pPr>
+              <w:jc w:val="center"/>
+            </w:pPr>
+            <w:r>
+              <w:rPr>
+                <w:rFonts w:ascii="Segoe UI" w:hAnsi="Segoe UI"/>
+                <w:b/>
+                <w:color w:val="FFFFFF"/>
+                <w:sz w:val="18"/>
+              </w:rPr>
+              <w:t>Categoría de Predio</w:t>
+            </w:r>
+          </w:p>
+        </w:tc>
+        <w:tc>
+          <w:tcPr>
+            <w:tcW w:type="dxa" w:w="1872"/>
+            <w:shd w:fill="2E4636"/>
+            <w:tcMar>
+              <w:top w:w="80" w:type="dxa"/>
+              <w:bottom w:w="80" w:type="dxa"/>
+              <w:left w:w="120" w:type="dxa"/>
+              <w:right w:w="120" w:type="dxa"/>
+            </w:tcMar>
+            <w:tcBorders>
+              <w:top w:val="single" w:sz="4" w:space="0" w:color="24382B"/>
+              <w:bottom w:val="single" w:sz="4" w:space="0" w:color="24382B"/>
+              <w:left w:val="single" w:sz="4" w:space="0" w:color="24382B"/>
+              <w:right w:val="single" w:sz="4" w:space="0" w:color="24382B"/>
+            </w:tcBorders>
+          </w:tcPr>
+          <w:p>
+            <w:pPr>
+              <w:jc w:val="center"/>
+            </w:pPr>
+            <w:r>
+              <w:rPr>
+                <w:rFonts w:ascii="Segoe UI" w:hAnsi="Segoe UI"/>
+                <w:b/>
+                <w:color w:val="FFFFFF"/>
+                <w:sz w:val="18"/>
+              </w:rPr>
+              <w:t>Total Entidades</w:t>
+            </w:r>
+          </w:p>
+        </w:tc>
+        <w:tc>
+          <w:tcPr>
+            <w:tcW w:type="dxa" w:w="2592"/>
+            <w:shd w:fill="2E4636"/>
+            <w:tcMar>
+              <w:top w:w="80" w:type="dxa"/>
+              <w:bottom w:w="80" w:type="dxa"/>
+              <w:left w:w="120" w:type="dxa"/>
+              <w:right w:w="120" w:type="dxa"/>
+            </w:tcMar>
+            <w:tcBorders>
+              <w:top w:val="single" w:sz="4" w:space="0" w:color="24382B"/>
+              <w:bottom w:val="single" w:sz="4" w:space="0" w:color="24382B"/>
+              <w:left w:val="single" w:sz="4" w:space="0" w:color="24382B"/>
+              <w:right w:val="single" w:sz="4" w:space="0" w:color="24382B"/>
+            </w:tcBorders>
+          </w:tcPr>
+          <w:p>
+            <w:pPr>
+              <w:jc w:val="center"/>
+            </w:pPr>
+            <w:r>
+              <w:rPr>
+                <w:rFonts w:ascii="Segoe UI" w:hAnsi="Segoe UI"/>
+                <w:b/>
+                <w:color w:val="FFFFFF"/>
+                <w:sz w:val="18"/>
+              </w:rPr>
+              <w:t>Fuente de Datos</w:t>
+            </w:r>
+          </w:p>
+        </w:tc>
+        <w:tc>
+          <w:tcPr>
+            <w:tcW w:type="dxa" w:w="2304"/>
+            <w:shd w:fill="2E4636"/>
+            <w:tcMar>
+              <w:top w:w="80" w:type="dxa"/>
+              <w:bottom w:w="80" w:type="dxa"/>
+              <w:left w:w="120" w:type="dxa"/>
+              <w:right w:w="120" w:type="dxa"/>
+            </w:tcMar>
+            <w:tcBorders>
+              <w:top w:val="single" w:sz="4" w:space="0" w:color="24382B"/>
+              <w:bottom w:val="single" w:sz="4" w:space="0" w:color="24382B"/>
+              <w:left w:val="single" w:sz="4" w:space="0" w:color="24382B"/>
+              <w:right w:val="single" w:sz="4" w:space="0" w:color="24382B"/>
+            </w:tcBorders>
+          </w:tcPr>
+          <w:p>
+            <w:pPr>
+              <w:jc w:val="center"/>
+            </w:pPr>
+            <w:r>
+              <w:rPr>
+                <w:rFonts w:ascii="Segoe UI" w:hAnsi="Segoe UI"/>
+                <w:b/>
+                <w:color w:val="FFFFFF"/>
+                <w:sz w:val="18"/>
+              </w:rPr>
+              <w:t>Estado en Visor / Consultas</w:t>
+            </w:r>
+          </w:p>
+        </w:tc>
+      </w:tr>
+      <w:tr>
+        <w:tc>
+          <w:tcPr>
+            <w:tcW w:type="dxa" w:w="2592"/>
+            <w:shd w:fill="FFFFFF"/>
+            <w:tcMar>
+              <w:top w:w="70" w:type="dxa"/>
+              <w:bottom w:w="70" w:type="dxa"/>
+              <w:left w:w="110" w:type="dxa"/>
+              <w:right w:w="110" w:type="dxa"/>
+            </w:tcMar>
+            <w:tcBorders>
+              <w:top w:val="single" w:sz="4" w:space="0" w:color="E2DFD6"/>
+              <w:bottom w:val="single" w:sz="4" w:space="0" w:color="E2DFD6"/>
+              <w:left w:val="single" w:sz="4" w:space="0" w:color="E2DFD6"/>
+              <w:right w:val="single" w:sz="4" w:space="0" w:color="E2DFD6"/>
+            </w:tcBorders>
+          </w:tcPr>
+          <w:p>
+            <w:pPr>
+              <w:jc w:val="left"/>
+            </w:pPr>
+            <w:r>
+              <w:rPr>
+                <w:rFonts w:ascii="Segoe UI" w:hAnsi="Segoe UI"/>
+                <w:color w:val="232820"/>
+                <w:sz w:val="17"/>
+              </w:rPr>
+              <w:t>Predios con Suministro Activo</w:t>
+            </w:r>
+          </w:p>
+        </w:tc>
+        <w:tc>
+          <w:tcPr>
+            <w:tcW w:type="dxa" w:w="1872"/>
+            <w:shd w:fill="FFFFFF"/>
+            <w:tcMar>
+              <w:top w:w="70" w:type="dxa"/>
+              <w:bottom w:w="70" w:type="dxa"/>
+              <w:left w:w="110" w:type="dxa"/>
+              <w:right w:w="110" w:type="dxa"/>
+            </w:tcMar>
+            <w:tcBorders>
+              <w:top w:val="single" w:sz="4" w:space="0" w:color="E2DFD6"/>
+              <w:bottom w:val="single" w:sz="4" w:space="0" w:color="E2DFD6"/>
+              <w:left w:val="single" w:sz="4" w:space="0" w:color="E2DFD6"/>
+              <w:right w:val="single" w:sz="4" w:space="0" w:color="E2DFD6"/>
+            </w:tcBorders>
+          </w:tcPr>
+          <w:p>
+            <w:pPr>
+              <w:jc w:val="left"/>
+            </w:pPr>
+            <w:r>
+              <w:rPr>
+                <w:rFonts w:ascii="Segoe UI" w:hAnsi="Segoe UI"/>
+                <w:color w:val="232820"/>
+                <w:sz w:val="17"/>
+              </w:rPr>
+              <w:t>5,118 registros</w:t>
+            </w:r>
+          </w:p>
+        </w:tc>
+        <w:tc>
+          <w:tcPr>
+            <w:tcW w:type="dxa" w:w="2592"/>
+            <w:shd w:fill="FFFFFF"/>
+            <w:tcMar>
+              <w:top w:w="70" w:type="dxa"/>
+              <w:bottom w:w="70" w:type="dxa"/>
+              <w:left w:w="110" w:type="dxa"/>
+              <w:right w:w="110" w:type="dxa"/>
+            </w:tcMar>
+            <w:tcBorders>
+              <w:top w:val="single" w:sz="4" w:space="0" w:color="E2DFD6"/>
+              <w:bottom w:val="single" w:sz="4" w:space="0" w:color="E2DFD6"/>
+              <w:left w:val="single" w:sz="4" w:space="0" w:color="E2DFD6"/>
+              <w:right w:val="single" w:sz="4" w:space="0" w:color="E2DFD6"/>
+            </w:tcBorders>
+          </w:tcPr>
+          <w:p>
+            <w:pPr>
+              <w:jc w:val="left"/>
+            </w:pPr>
+            <w:r>
+              <w:rPr>
+                <w:rFonts w:ascii="Segoe UI" w:hAnsi="Segoe UI"/>
+                <w:color w:val="232820"/>
+                <w:sz w:val="17"/>
+              </w:rPr>
+              <w:t>dbo.CodigosFijos + dbo.Lotes</w:t>
+            </w:r>
+          </w:p>
+        </w:tc>
+        <w:tc>
+          <w:tcPr>
+            <w:tcW w:type="dxa" w:w="2304"/>
+            <w:shd w:fill="FFFFFF"/>
+            <w:tcMar>
+              <w:top w:w="70" w:type="dxa"/>
+              <w:bottom w:w="70" w:type="dxa"/>
+              <w:left w:w="110" w:type="dxa"/>
+              <w:right w:w="110" w:type="dxa"/>
+            </w:tcMar>
+            <w:tcBorders>
+              <w:top w:val="single" w:sz="4" w:space="0" w:color="E2DFD6"/>
+              <w:bottom w:val="single" w:sz="4" w:space="0" w:color="E2DFD6"/>
+              <w:left w:val="single" w:sz="4" w:space="0" w:color="E2DFD6"/>
+              <w:right w:val="single" w:sz="4" w:space="0" w:color="E2DFD6"/>
+            </w:tcBorders>
+          </w:tcPr>
+          <w:p>
+            <w:pPr>
+              <w:jc w:val="left"/>
+            </w:pPr>
+            <w:r>
+              <w:rPr>
+                <w:rFonts w:ascii="Segoe UI" w:hAnsi="Segoe UI"/>
+                <w:color w:val="232820"/>
+                <w:sz w:val="17"/>
+              </w:rPr>
+              <w:t>Identificados por Código Fijo y Nombre de Titular</w:t>
+            </w:r>
+          </w:p>
+        </w:tc>
+      </w:tr>
+      <w:tr>
+        <w:tc>
+          <w:tcPr>
+            <w:tcW w:type="dxa" w:w="2592"/>
+            <w:shd w:fill="F9F8F4"/>
+            <w:tcMar>
+              <w:top w:w="70" w:type="dxa"/>
+              <w:bottom w:w="70" w:type="dxa"/>
+              <w:left w:w="110" w:type="dxa"/>
+              <w:right w:w="110" w:type="dxa"/>
+            </w:tcMar>
+            <w:tcBorders>
+              <w:top w:val="single" w:sz="4" w:space="0" w:color="E2DFD6"/>
+              <w:bottom w:val="single" w:sz="4" w:space="0" w:color="E2DFD6"/>
+              <w:left w:val="single" w:sz="4" w:space="0" w:color="E2DFD6"/>
+              <w:right w:val="single" w:sz="4" w:space="0" w:color="E2DFD6"/>
+            </w:tcBorders>
+          </w:tcPr>
+          <w:p>
+            <w:pPr>
+              <w:jc w:val="left"/>
+            </w:pPr>
+            <w:r>
+              <w:rPr>
+                <w:rFonts w:ascii="Segoe UI" w:hAnsi="Segoe UI"/>
+                <w:color w:val="232820"/>
+                <w:sz w:val="17"/>
+              </w:rPr>
+              <w:t>Terrenos Baldíos / Sin Medidor</w:t>
+            </w:r>
+          </w:p>
+        </w:tc>
+        <w:tc>
+          <w:tcPr>
+            <w:tcW w:type="dxa" w:w="1872"/>
+            <w:shd w:fill="F9F8F4"/>
+            <w:tcMar>
+              <w:top w:w="70" w:type="dxa"/>
+              <w:bottom w:w="70" w:type="dxa"/>
+              <w:left w:w="110" w:type="dxa"/>
+              <w:right w:w="110" w:type="dxa"/>
+            </w:tcMar>
+            <w:tcBorders>
+              <w:top w:val="single" w:sz="4" w:space="0" w:color="E2DFD6"/>
+              <w:bottom w:val="single" w:sz="4" w:space="0" w:color="E2DFD6"/>
+              <w:left w:val="single" w:sz="4" w:space="0" w:color="E2DFD6"/>
+              <w:right w:val="single" w:sz="4" w:space="0" w:color="E2DFD6"/>
+            </w:tcBorders>
+          </w:tcPr>
+          <w:p>
+            <w:pPr>
+              <w:jc w:val="left"/>
+            </w:pPr>
+            <w:r>
+              <w:rPr>
+                <w:rFonts w:ascii="Segoe UI" w:hAnsi="Segoe UI"/>
+                <w:color w:val="232820"/>
+                <w:sz w:val="17"/>
+              </w:rPr>
+              <w:t>11,333 registros</w:t>
+            </w:r>
+          </w:p>
+        </w:tc>
+        <w:tc>
+          <w:tcPr>
+            <w:tcW w:type="dxa" w:w="2592"/>
+            <w:shd w:fill="F9F8F4"/>
+            <w:tcMar>
+              <w:top w:w="70" w:type="dxa"/>
+              <w:bottom w:w="70" w:type="dxa"/>
+              <w:left w:w="110" w:type="dxa"/>
+              <w:right w:w="110" w:type="dxa"/>
+            </w:tcMar>
+            <w:tcBorders>
+              <w:top w:val="single" w:sz="4" w:space="0" w:color="E2DFD6"/>
+              <w:bottom w:val="single" w:sz="4" w:space="0" w:color="E2DFD6"/>
+              <w:left w:val="single" w:sz="4" w:space="0" w:color="E2DFD6"/>
+              <w:right w:val="single" w:sz="4" w:space="0" w:color="E2DFD6"/>
+            </w:tcBorders>
+          </w:tcPr>
+          <w:p>
+            <w:pPr>
+              <w:jc w:val="left"/>
+            </w:pPr>
+            <w:r>
+              <w:rPr>
+                <w:rFonts w:ascii="Segoe UI" w:hAnsi="Segoe UI"/>
+                <w:color w:val="232820"/>
+                <w:sz w:val="17"/>
+              </w:rPr>
+              <w:t>dbo.Lotes (sin código fijo)</w:t>
+            </w:r>
+          </w:p>
+        </w:tc>
+        <w:tc>
+          <w:tcPr>
+            <w:tcW w:type="dxa" w:w="2304"/>
+            <w:shd w:fill="F9F8F4"/>
+            <w:tcMar>
+              <w:top w:w="70" w:type="dxa"/>
+              <w:bottom w:w="70" w:type="dxa"/>
+              <w:left w:w="110" w:type="dxa"/>
+              <w:right w:w="110" w:type="dxa"/>
+            </w:tcMar>
+            <w:tcBorders>
+              <w:top w:val="single" w:sz="4" w:space="0" w:color="E2DFD6"/>
+              <w:bottom w:val="single" w:sz="4" w:space="0" w:color="E2DFD6"/>
+              <w:left w:val="single" w:sz="4" w:space="0" w:color="E2DFD6"/>
+              <w:right w:val="single" w:sz="4" w:space="0" w:color="E2DFD6"/>
+            </w:tcBorders>
+          </w:tcPr>
+          <w:p>
+            <w:pPr>
+              <w:jc w:val="left"/>
+            </w:pPr>
+            <w:r>
+              <w:rPr>
+                <w:rFonts w:ascii="Segoe UI" w:hAnsi="Segoe UI"/>
+                <w:color w:val="232820"/>
+                <w:sz w:val="17"/>
+              </w:rPr>
+              <w:t>Registrados como '(Sin Suministro / Terreno Baldío)' con centroide</w:t>
+            </w:r>
+          </w:p>
+        </w:tc>
+      </w:tr>
+      <w:tr>
+        <w:tc>
+          <w:tcPr>
+            <w:tcW w:type="dxa" w:w="2592"/>
+            <w:shd w:fill="FFFFFF"/>
+            <w:tcMar>
+              <w:top w:w="70" w:type="dxa"/>
+              <w:bottom w:w="70" w:type="dxa"/>
+              <w:left w:w="110" w:type="dxa"/>
+              <w:right w:w="110" w:type="dxa"/>
+            </w:tcMar>
+            <w:tcBorders>
+              <w:top w:val="single" w:sz="4" w:space="0" w:color="E2DFD6"/>
+              <w:bottom w:val="single" w:sz="4" w:space="0" w:color="E2DFD6"/>
+              <w:left w:val="single" w:sz="4" w:space="0" w:color="E2DFD6"/>
+              <w:right w:val="single" w:sz="4" w:space="0" w:color="E2DFD6"/>
+            </w:tcBorders>
+          </w:tcPr>
+          <w:p>
+            <w:pPr>
+              <w:jc w:val="left"/>
+            </w:pPr>
+            <w:r>
+              <w:rPr>
+                <w:rFonts w:ascii="Segoe UI" w:hAnsi="Segoe UI"/>
+                <w:color w:val="232820"/>
+                <w:sz w:val="17"/>
+              </w:rPr>
+              <w:t>Universo Predial Consolidado</w:t>
+            </w:r>
+          </w:p>
+        </w:tc>
+        <w:tc>
+          <w:tcPr>
+            <w:tcW w:type="dxa" w:w="1872"/>
+            <w:shd w:fill="FFFFFF"/>
+            <w:tcMar>
+              <w:top w:w="70" w:type="dxa"/>
+              <w:bottom w:w="70" w:type="dxa"/>
+              <w:left w:w="110" w:type="dxa"/>
+              <w:right w:w="110" w:type="dxa"/>
+            </w:tcMar>
+            <w:tcBorders>
+              <w:top w:val="single" w:sz="4" w:space="0" w:color="E2DFD6"/>
+              <w:bottom w:val="single" w:sz="4" w:space="0" w:color="E2DFD6"/>
+              <w:left w:val="single" w:sz="4" w:space="0" w:color="E2DFD6"/>
+              <w:right w:val="single" w:sz="4" w:space="0" w:color="E2DFD6"/>
+            </w:tcBorders>
+          </w:tcPr>
+          <w:p>
+            <w:pPr>
+              <w:jc w:val="left"/>
+            </w:pPr>
+            <w:r>
+              <w:rPr>
+                <w:rFonts w:ascii="Segoe UI" w:hAnsi="Segoe UI"/>
+                <w:color w:val="232820"/>
+                <w:sz w:val="17"/>
+              </w:rPr>
+              <w:t>16,451 registros</w:t>
+            </w:r>
+          </w:p>
+        </w:tc>
+        <w:tc>
+          <w:tcPr>
+            <w:tcW w:type="dxa" w:w="2592"/>
+            <w:shd w:fill="FFFFFF"/>
+            <w:tcMar>
+              <w:top w:w="70" w:type="dxa"/>
+              <w:bottom w:w="70" w:type="dxa"/>
+              <w:left w:w="110" w:type="dxa"/>
+              <w:right w:w="110" w:type="dxa"/>
+            </w:tcMar>
+            <w:tcBorders>
+              <w:top w:val="single" w:sz="4" w:space="0" w:color="E2DFD6"/>
+              <w:bottom w:val="single" w:sz="4" w:space="0" w:color="E2DFD6"/>
+              <w:left w:val="single" w:sz="4" w:space="0" w:color="E2DFD6"/>
+              <w:right w:val="single" w:sz="4" w:space="0" w:color="E2DFD6"/>
+            </w:tcBorders>
+          </w:tcPr>
+          <w:p>
+            <w:pPr>
+              <w:jc w:val="left"/>
+            </w:pPr>
+            <w:r>
+              <w:rPr>
+                <w:rFonts w:ascii="Segoe UI" w:hAnsi="Segoe UI"/>
+                <w:color w:val="232820"/>
+                <w:sz w:val="17"/>
+              </w:rPr>
+              <w:t>dbo.Lotes + dbo.CodigosFijos</w:t>
+            </w:r>
+          </w:p>
+        </w:tc>
+        <w:tc>
+          <w:tcPr>
+            <w:tcW w:type="dxa" w:w="2304"/>
+            <w:shd w:fill="FFFFFF"/>
+            <w:tcMar>
+              <w:top w:w="70" w:type="dxa"/>
+              <w:bottom w:w="70" w:type="dxa"/>
+              <w:left w:w="110" w:type="dxa"/>
+              <w:right w:w="110" w:type="dxa"/>
+            </w:tcMar>
+            <w:tcBorders>
+              <w:top w:val="single" w:sz="4" w:space="0" w:color="E2DFD6"/>
+              <w:bottom w:val="single" w:sz="4" w:space="0" w:color="E2DFD6"/>
+              <w:left w:val="single" w:sz="4" w:space="0" w:color="E2DFD6"/>
+              <w:right w:val="single" w:sz="4" w:space="0" w:color="E2DFD6"/>
+            </w:tcBorders>
+          </w:tcPr>
+          <w:p>
+            <w:pPr>
+              <w:jc w:val="left"/>
+            </w:pPr>
+            <w:r>
+              <w:rPr>
+                <w:rFonts w:ascii="Segoe UI" w:hAnsi="Segoe UI"/>
+                <w:color w:val="232820"/>
+                <w:sz w:val="17"/>
+              </w:rPr>
+              <w:t>Disponibles en el selector de filtros y tabla paginada</w:t>
+            </w:r>
+          </w:p>
+        </w:tc>
+      </w:tr>
+    </w:tbl>
+    <w:p>
+      <w:pPr>
+        <w:spacing w:before="40" w:after="80"/>
+      </w:pPr>
+    </w:p>
+    <w:p>
+      <w:pPr>
+        <w:keepNext/>
         <w:spacing w:before="320" w:after="120"/>
       </w:pPr>
       <w:r>
@@ -7192,7 +7865,7 @@
           <w:color w:val="1F382B"/>
           <w:sz w:val="30"/>
         </w:rPr>
-        <w:t>8. Diseño de la Interfaz de Usuario y Experiencia de Operación (UIX)</w:t>
+        <w:t>8. Diseño de Interfaz (UIX), Arquitectura Móvil PWA y Geolocalización (Anexo F.7)</w:t>
       </w:r>
     </w:p>
     <w:p>
@@ -7643,6 +8316,150 @@
           <w:sz w:val="17"/>
         </w:rPr>
         <w:t>Figura: Registro histórico de auditoría con trazabilidad de cambios de suministro</w:t>
+      </w:r>
+    </w:p>
+    <w:p>
+      <w:pPr>
+        <w:keepNext/>
+        <w:spacing w:before="240" w:after="80"/>
+      </w:pPr>
+      <w:r>
+        <w:rPr>
+          <w:rFonts w:ascii="Segoe UI" w:hAnsi="Segoe UI"/>
+          <w:b/>
+          <w:color w:val="2E4636"/>
+          <w:sz w:val="25"/>
+        </w:rPr>
+        <w:t>Arquitectura Móvil PWA y Geolocalización en Terreno (Anexo F.7)</w:t>
+      </w:r>
+    </w:p>
+    <w:p>
+      <w:pPr>
+        <w:spacing w:after="100" w:line="276" w:lineRule="auto"/>
+      </w:pPr>
+      <w:r>
+        <w:rPr>
+          <w:rFonts w:ascii="Segoe UI" w:hAnsi="Segoe UI"/>
+          <w:i w:val="0"/>
+          <w:color w:val="2D302A"/>
+          <w:sz w:val="20"/>
+        </w:rPr>
+        <w:t>Para dar estricto cumplimiento al Pliego de Especificaciones del docente (Sección 1.2, 2.2, 2.3 y Anexo F.7: 'Mockup de Pantallas en Dispositivos Móviles'), VisorDatosSIG fue dotado de capacidades Progressive Web App (PWA) y diseño adaptativo responsive de nivel empresarial, sin incurrir en costos de tiendas comerciales (App Store o Play Store):</w:t>
+      </w:r>
+    </w:p>
+    <w:p>
+      <w:pPr>
+        <w:pStyle w:val="ListBullet"/>
+        <w:spacing w:after="60" w:line="269" w:lineRule="auto"/>
+      </w:pPr>
+      <w:r>
+        <w:rPr>
+          <w:rFonts w:ascii="Segoe UI" w:hAnsi="Segoe UI"/>
+          <w:b/>
+          <w:color w:val="23281E"/>
+          <w:sz w:val="19"/>
+        </w:rPr>
+        <w:t xml:space="preserve">Web App Manifest Institucional: </w:t>
+      </w:r>
+      <w:r>
+        <w:rPr>
+          <w:rFonts w:ascii="Segoe UI" w:hAnsi="Segoe UI"/>
+          <w:color w:val="2D302A"/>
+          <w:sz w:val="19"/>
+        </w:rPr>
+        <w:t>Incorporación del archivo manifest.json con identidad visual de la institución, paleta #2E4636 / #F5F3EC, iconos en alta resolución y modo 'standalone' que permite al operario instalar la aplicación directamente en la pantalla de inicio de su teléfono móvil o tableta.</w:t>
+      </w:r>
+    </w:p>
+    <w:p>
+      <w:pPr>
+        <w:pStyle w:val="ListBullet"/>
+        <w:spacing w:after="60" w:line="269" w:lineRule="auto"/>
+      </w:pPr>
+      <w:r>
+        <w:rPr>
+          <w:rFonts w:ascii="Segoe UI" w:hAnsi="Segoe UI"/>
+          <w:b/>
+          <w:color w:val="23281E"/>
+          <w:sz w:val="19"/>
+        </w:rPr>
+        <w:t xml:space="preserve">Service Worker y Caché Offline: </w:t>
+      </w:r>
+      <w:r>
+        <w:rPr>
+          <w:rFonts w:ascii="Segoe UI" w:hAnsi="Segoe UI"/>
+          <w:color w:val="2D302A"/>
+          <w:sz w:val="19"/>
+        </w:rPr>
+        <w:t>Implementación de sw.js con estrategia Cache-First para recursos estáticos (CSS, librerías Leaflet, iconos, fuentes) y Network-First para consultas espaciales y transacciones de seguridad, garantizando arranque instantáneo en terreno.</w:t>
+      </w:r>
+    </w:p>
+    <w:p>
+      <w:pPr>
+        <w:pStyle w:val="ListBullet"/>
+        <w:spacing w:after="60" w:line="269" w:lineRule="auto"/>
+      </w:pPr>
+      <w:r>
+        <w:rPr>
+          <w:rFonts w:ascii="Segoe UI" w:hAnsi="Segoe UI"/>
+          <w:b/>
+          <w:color w:val="23281E"/>
+          <w:sz w:val="19"/>
+        </w:rPr>
+        <w:t xml:space="preserve">Diseño Táctil Responsive (360px+): </w:t>
+      </w:r>
+      <w:r>
+        <w:rPr>
+          <w:rFonts w:ascii="Segoe UI" w:hAnsi="Segoe UI"/>
+          <w:color w:val="2D302A"/>
+          <w:sz w:val="19"/>
+        </w:rPr>
+        <w:t>El visor cartográfico y las tablas de consulta se adaptan con fluidez a pantallas ultra-estrechas desde 360 píxeles de ancho (Samsung Galaxy, iPhone SE, Xiaomi), reorganizando menús en drawers táctiles y colapsando paneles laterales.</w:t>
+      </w:r>
+    </w:p>
+    <w:p>
+      <w:pPr>
+        <w:pStyle w:val="ListBullet"/>
+        <w:spacing w:after="60" w:line="269" w:lineRule="auto"/>
+      </w:pPr>
+      <w:r>
+        <w:rPr>
+          <w:rFonts w:ascii="Segoe UI" w:hAnsi="Segoe UI"/>
+          <w:b/>
+          <w:color w:val="23281E"/>
+          <w:sz w:val="19"/>
+        </w:rPr>
+        <w:t xml:space="preserve">Ficha Técnica Móvil tipo Bottom Sheet: </w:t>
+      </w:r>
+      <w:r>
+        <w:rPr>
+          <w:rFonts w:ascii="Segoe UI" w:hAnsi="Segoe UI"/>
+          <w:color w:val="2D302A"/>
+          <w:sz w:val="19"/>
+        </w:rPr>
+        <w:t>El panel de detalles de inmuebles se transforma automáticamente en una tarjeta deslizable inferior (Bottom Sheet) en pantallas móviles, permitiendo al inspector visualizar los atributos del lote sin perder de vista su posición cartográfica.</w:t>
+      </w:r>
+    </w:p>
+    <w:p>
+      <w:pPr>
+        <w:pStyle w:val="ListBullet"/>
+        <w:spacing w:after="60" w:line="269" w:lineRule="auto"/>
+      </w:pPr>
+      <w:r>
+        <w:rPr>
+          <w:rFonts w:ascii="Segoe UI" w:hAnsi="Segoe UI"/>
+          <w:b/>
+          <w:color w:val="23281E"/>
+          <w:sz w:val="19"/>
+        </w:rPr>
+        <w:t xml:space="preserve">Geolocalización GPS en Tiempo Real: </w:t>
+      </w:r>
+      <w:r>
+        <w:rPr>
+          <w:rFonts w:ascii="Segoe UI" w:hAnsi="Segoe UI"/>
+          <w:color w:val="2D302A"/>
+          <w:sz w:val="19"/>
+        </w:rPr>
+        <w:t>Se integró el botón 'Mi Ubicación' con la API HTML5 navigator.geolocation y highAccuracy: true, permitiendo al funcionario municipal geolocalizarse en tiempo real en las calles de San Ignacio de Velasco con indicación de radio de precisión en metros.</w:t>
       </w:r>
     </w:p>
     <w:p>
@@ -8900,7 +9717,1192 @@
           <w:color w:val="1F382B"/>
           <w:sz w:val="30"/>
         </w:rPr>
-        <w:t>10. Guía de Instalación, Configuración y Despliegue Local</w:t>
+        <w:t>10. Catálogo y Selección de Agent Skills para Optimización del Proyecto</w:t>
+      </w:r>
+    </w:p>
+    <w:p>
+      <w:pPr>
+        <w:spacing w:after="100" w:line="276" w:lineRule="auto"/>
+      </w:pPr>
+      <w:r>
+        <w:rPr>
+          <w:rFonts w:ascii="Segoe UI" w:hAnsi="Segoe UI"/>
+          <w:i w:val="0"/>
+          <w:color w:val="2D302A"/>
+          <w:sz w:val="20"/>
+        </w:rPr>
+        <w:t>A partir del catálogo respaldado de 310 herramientas especializadas (Agent Skills), se seleccionó un conjunto estratégico de 8 skills de alto impacto para elevar la eficiencia arquitectónica, la robustez del backend, la experiencia móvil y el cumplimiento riguroso de las especificaciones docentes:</w:t>
+      </w:r>
+    </w:p>
+    <w:tbl>
+      <w:tblPr>
+        <w:tblW w:type="auto" w:w="0"/>
+        <w:jc w:val="center"/>
+        <w:tblLook w:firstColumn="1" w:firstRow="1" w:lastColumn="0" w:lastRow="0" w:noHBand="0" w:noVBand="1" w:val="04A0"/>
+      </w:tblPr>
+      <w:tblGrid>
+        <w:gridCol w:w="2340"/>
+        <w:gridCol w:w="2340"/>
+        <w:gridCol w:w="2340"/>
+        <w:gridCol w:w="2340"/>
+      </w:tblGrid>
+      <w:tr>
+        <w:tc>
+          <w:tcPr>
+            <w:tcW w:type="dxa" w:w="2160"/>
+            <w:shd w:fill="2E4636"/>
+            <w:tcMar>
+              <w:top w:w="80" w:type="dxa"/>
+              <w:bottom w:w="80" w:type="dxa"/>
+              <w:left w:w="120" w:type="dxa"/>
+              <w:right w:w="120" w:type="dxa"/>
+            </w:tcMar>
+            <w:tcBorders>
+              <w:top w:val="single" w:sz="4" w:space="0" w:color="24382B"/>
+              <w:bottom w:val="single" w:sz="4" w:space="0" w:color="24382B"/>
+              <w:left w:val="single" w:sz="4" w:space="0" w:color="24382B"/>
+              <w:right w:val="single" w:sz="4" w:space="0" w:color="24382B"/>
+            </w:tcBorders>
+          </w:tcPr>
+          <w:p>
+            <w:pPr>
+              <w:jc w:val="center"/>
+            </w:pPr>
+            <w:r>
+              <w:rPr>
+                <w:rFonts w:ascii="Segoe UI" w:hAnsi="Segoe UI"/>
+                <w:b/>
+                <w:color w:val="FFFFFF"/>
+                <w:sz w:val="18"/>
+              </w:rPr>
+              <w:t>Skill Seleccionada</w:t>
+            </w:r>
+          </w:p>
+        </w:tc>
+        <w:tc>
+          <w:tcPr>
+            <w:tcW w:type="dxa" w:w="1728"/>
+            <w:shd w:fill="2E4636"/>
+            <w:tcMar>
+              <w:top w:w="80" w:type="dxa"/>
+              <w:bottom w:w="80" w:type="dxa"/>
+              <w:left w:w="120" w:type="dxa"/>
+              <w:right w:w="120" w:type="dxa"/>
+            </w:tcMar>
+            <w:tcBorders>
+              <w:top w:val="single" w:sz="4" w:space="0" w:color="24382B"/>
+              <w:bottom w:val="single" w:sz="4" w:space="0" w:color="24382B"/>
+              <w:left w:val="single" w:sz="4" w:space="0" w:color="24382B"/>
+              <w:right w:val="single" w:sz="4" w:space="0" w:color="24382B"/>
+            </w:tcBorders>
+          </w:tcPr>
+          <w:p>
+            <w:pPr>
+              <w:jc w:val="center"/>
+            </w:pPr>
+            <w:r>
+              <w:rPr>
+                <w:rFonts w:ascii="Segoe UI" w:hAnsi="Segoe UI"/>
+                <w:b/>
+                <w:color w:val="FFFFFF"/>
+                <w:sz w:val="18"/>
+              </w:rPr>
+              <w:t>Área de Impacto</w:t>
+            </w:r>
+          </w:p>
+        </w:tc>
+        <w:tc>
+          <w:tcPr>
+            <w:tcW w:type="dxa" w:w="2880"/>
+            <w:shd w:fill="2E4636"/>
+            <w:tcMar>
+              <w:top w:w="80" w:type="dxa"/>
+              <w:bottom w:w="80" w:type="dxa"/>
+              <w:left w:w="120" w:type="dxa"/>
+              <w:right w:w="120" w:type="dxa"/>
+            </w:tcMar>
+            <w:tcBorders>
+              <w:top w:val="single" w:sz="4" w:space="0" w:color="24382B"/>
+              <w:bottom w:val="single" w:sz="4" w:space="0" w:color="24382B"/>
+              <w:left w:val="single" w:sz="4" w:space="0" w:color="24382B"/>
+              <w:right w:val="single" w:sz="4" w:space="0" w:color="24382B"/>
+            </w:tcBorders>
+          </w:tcPr>
+          <w:p>
+            <w:pPr>
+              <w:jc w:val="center"/>
+            </w:pPr>
+            <w:r>
+              <w:rPr>
+                <w:rFonts w:ascii="Segoe UI" w:hAnsi="Segoe UI"/>
+                <w:b/>
+                <w:color w:val="FFFFFF"/>
+                <w:sz w:val="18"/>
+              </w:rPr>
+              <w:t>Comando de Reinstalación CLI</w:t>
+            </w:r>
+          </w:p>
+        </w:tc>
+        <w:tc>
+          <w:tcPr>
+            <w:tcW w:type="dxa" w:w="3312"/>
+            <w:shd w:fill="2E4636"/>
+            <w:tcMar>
+              <w:top w:w="80" w:type="dxa"/>
+              <w:bottom w:w="80" w:type="dxa"/>
+              <w:left w:w="120" w:type="dxa"/>
+              <w:right w:w="120" w:type="dxa"/>
+            </w:tcMar>
+            <w:tcBorders>
+              <w:top w:val="single" w:sz="4" w:space="0" w:color="24382B"/>
+              <w:bottom w:val="single" w:sz="4" w:space="0" w:color="24382B"/>
+              <w:left w:val="single" w:sz="4" w:space="0" w:color="24382B"/>
+              <w:right w:val="single" w:sz="4" w:space="0" w:color="24382B"/>
+            </w:tcBorders>
+          </w:tcPr>
+          <w:p>
+            <w:pPr>
+              <w:jc w:val="center"/>
+            </w:pPr>
+            <w:r>
+              <w:rPr>
+                <w:rFonts w:ascii="Segoe UI" w:hAnsi="Segoe UI"/>
+                <w:b/>
+                <w:color w:val="FFFFFF"/>
+                <w:sz w:val="18"/>
+              </w:rPr>
+              <w:t>Justificación Técnica y Aporte al Proyecto</w:t>
+            </w:r>
+          </w:p>
+        </w:tc>
+      </w:tr>
+      <w:tr>
+        <w:tc>
+          <w:tcPr>
+            <w:tcW w:type="dxa" w:w="2160"/>
+            <w:shd w:fill="FFFFFF"/>
+            <w:tcMar>
+              <w:top w:w="70" w:type="dxa"/>
+              <w:bottom w:w="70" w:type="dxa"/>
+              <w:left w:w="110" w:type="dxa"/>
+              <w:right w:w="110" w:type="dxa"/>
+            </w:tcMar>
+            <w:tcBorders>
+              <w:top w:val="single" w:sz="4" w:space="0" w:color="E2DFD6"/>
+              <w:bottom w:val="single" w:sz="4" w:space="0" w:color="E2DFD6"/>
+              <w:left w:val="single" w:sz="4" w:space="0" w:color="E2DFD6"/>
+              <w:right w:val="single" w:sz="4" w:space="0" w:color="E2DFD6"/>
+            </w:tcBorders>
+          </w:tcPr>
+          <w:p>
+            <w:pPr>
+              <w:jc w:val="left"/>
+            </w:pPr>
+            <w:r>
+              <w:rPr>
+                <w:rFonts w:ascii="Segoe UI" w:hAnsi="Segoe UI"/>
+                <w:color w:val="232820"/>
+                <w:sz w:val="17"/>
+              </w:rPr>
+              <w:t>dotnet-backend-patterns</w:t>
+            </w:r>
+          </w:p>
+        </w:tc>
+        <w:tc>
+          <w:tcPr>
+            <w:tcW w:type="dxa" w:w="1728"/>
+            <w:shd w:fill="FFFFFF"/>
+            <w:tcMar>
+              <w:top w:w="70" w:type="dxa"/>
+              <w:bottom w:w="70" w:type="dxa"/>
+              <w:left w:w="110" w:type="dxa"/>
+              <w:right w:w="110" w:type="dxa"/>
+            </w:tcMar>
+            <w:tcBorders>
+              <w:top w:val="single" w:sz="4" w:space="0" w:color="E2DFD6"/>
+              <w:bottom w:val="single" w:sz="4" w:space="0" w:color="E2DFD6"/>
+              <w:left w:val="single" w:sz="4" w:space="0" w:color="E2DFD6"/>
+              <w:right w:val="single" w:sz="4" w:space="0" w:color="E2DFD6"/>
+            </w:tcBorders>
+          </w:tcPr>
+          <w:p>
+            <w:pPr>
+              <w:jc w:val="left"/>
+            </w:pPr>
+            <w:r>
+              <w:rPr>
+                <w:rFonts w:ascii="Segoe UI" w:hAnsi="Segoe UI"/>
+                <w:color w:val="232820"/>
+                <w:sz w:val="17"/>
+              </w:rPr>
+              <w:t>Backend .NET 8 / C#</w:t>
+            </w:r>
+          </w:p>
+        </w:tc>
+        <w:tc>
+          <w:tcPr>
+            <w:tcW w:type="dxa" w:w="2880"/>
+            <w:shd w:fill="FFFFFF"/>
+            <w:tcMar>
+              <w:top w:w="70" w:type="dxa"/>
+              <w:bottom w:w="70" w:type="dxa"/>
+              <w:left w:w="110" w:type="dxa"/>
+              <w:right w:w="110" w:type="dxa"/>
+            </w:tcMar>
+            <w:tcBorders>
+              <w:top w:val="single" w:sz="4" w:space="0" w:color="E2DFD6"/>
+              <w:bottom w:val="single" w:sz="4" w:space="0" w:color="E2DFD6"/>
+              <w:left w:val="single" w:sz="4" w:space="0" w:color="E2DFD6"/>
+              <w:right w:val="single" w:sz="4" w:space="0" w:color="E2DFD6"/>
+            </w:tcBorders>
+          </w:tcPr>
+          <w:p>
+            <w:pPr>
+              <w:jc w:val="left"/>
+            </w:pPr>
+            <w:r>
+              <w:rPr>
+                <w:rFonts w:ascii="Segoe UI" w:hAnsi="Segoe UI"/>
+                <w:color w:val="232820"/>
+                <w:sz w:val="17"/>
+              </w:rPr>
+              <w:t>npx @rmyndharis/antigravity-skills install dotnet-backend-patterns</w:t>
+            </w:r>
+          </w:p>
+        </w:tc>
+        <w:tc>
+          <w:tcPr>
+            <w:tcW w:type="dxa" w:w="3312"/>
+            <w:shd w:fill="FFFFFF"/>
+            <w:tcMar>
+              <w:top w:w="70" w:type="dxa"/>
+              <w:bottom w:w="70" w:type="dxa"/>
+              <w:left w:w="110" w:type="dxa"/>
+              <w:right w:w="110" w:type="dxa"/>
+            </w:tcMar>
+            <w:tcBorders>
+              <w:top w:val="single" w:sz="4" w:space="0" w:color="E2DFD6"/>
+              <w:bottom w:val="single" w:sz="4" w:space="0" w:color="E2DFD6"/>
+              <w:left w:val="single" w:sz="4" w:space="0" w:color="E2DFD6"/>
+              <w:right w:val="single" w:sz="4" w:space="0" w:color="E2DFD6"/>
+            </w:tcBorders>
+          </w:tcPr>
+          <w:p>
+            <w:pPr>
+              <w:jc w:val="left"/>
+            </w:pPr>
+            <w:r>
+              <w:rPr>
+                <w:rFonts w:ascii="Segoe UI" w:hAnsi="Segoe UI"/>
+                <w:color w:val="232820"/>
+                <w:sz w:val="17"/>
+              </w:rPr>
+              <w:t>Alinea el código con patrones idiomáticos de .NET 8, inyección de dependencias, DTOs inmutables, repositorios Dapper y manejo estructurado de excepciones.</w:t>
+            </w:r>
+          </w:p>
+        </w:tc>
+      </w:tr>
+      <w:tr>
+        <w:tc>
+          <w:tcPr>
+            <w:tcW w:type="dxa" w:w="2160"/>
+            <w:shd w:fill="F9F8F4"/>
+            <w:tcMar>
+              <w:top w:w="70" w:type="dxa"/>
+              <w:bottom w:w="70" w:type="dxa"/>
+              <w:left w:w="110" w:type="dxa"/>
+              <w:right w:w="110" w:type="dxa"/>
+            </w:tcMar>
+            <w:tcBorders>
+              <w:top w:val="single" w:sz="4" w:space="0" w:color="E2DFD6"/>
+              <w:bottom w:val="single" w:sz="4" w:space="0" w:color="E2DFD6"/>
+              <w:left w:val="single" w:sz="4" w:space="0" w:color="E2DFD6"/>
+              <w:right w:val="single" w:sz="4" w:space="0" w:color="E2DFD6"/>
+            </w:tcBorders>
+          </w:tcPr>
+          <w:p>
+            <w:pPr>
+              <w:jc w:val="left"/>
+            </w:pPr>
+            <w:r>
+              <w:rPr>
+                <w:rFonts w:ascii="Segoe UI" w:hAnsi="Segoe UI"/>
+                <w:color w:val="232820"/>
+                <w:sz w:val="17"/>
+              </w:rPr>
+              <w:t>performance-optimization</w:t>
+            </w:r>
+          </w:p>
+        </w:tc>
+        <w:tc>
+          <w:tcPr>
+            <w:tcW w:type="dxa" w:w="1728"/>
+            <w:shd w:fill="F9F8F4"/>
+            <w:tcMar>
+              <w:top w:w="70" w:type="dxa"/>
+              <w:bottom w:w="70" w:type="dxa"/>
+              <w:left w:w="110" w:type="dxa"/>
+              <w:right w:w="110" w:type="dxa"/>
+            </w:tcMar>
+            <w:tcBorders>
+              <w:top w:val="single" w:sz="4" w:space="0" w:color="E2DFD6"/>
+              <w:bottom w:val="single" w:sz="4" w:space="0" w:color="E2DFD6"/>
+              <w:left w:val="single" w:sz="4" w:space="0" w:color="E2DFD6"/>
+              <w:right w:val="single" w:sz="4" w:space="0" w:color="E2DFD6"/>
+            </w:tcBorders>
+          </w:tcPr>
+          <w:p>
+            <w:pPr>
+              <w:jc w:val="left"/>
+            </w:pPr>
+            <w:r>
+              <w:rPr>
+                <w:rFonts w:ascii="Segoe UI" w:hAnsi="Segoe UI"/>
+                <w:color w:val="232820"/>
+                <w:sz w:val="17"/>
+              </w:rPr>
+              <w:t>Rendimiento &amp; Profiling</w:t>
+            </w:r>
+          </w:p>
+        </w:tc>
+        <w:tc>
+          <w:tcPr>
+            <w:tcW w:type="dxa" w:w="2880"/>
+            <w:shd w:fill="F9F8F4"/>
+            <w:tcMar>
+              <w:top w:w="70" w:type="dxa"/>
+              <w:bottom w:w="70" w:type="dxa"/>
+              <w:left w:w="110" w:type="dxa"/>
+              <w:right w:w="110" w:type="dxa"/>
+            </w:tcMar>
+            <w:tcBorders>
+              <w:top w:val="single" w:sz="4" w:space="0" w:color="E2DFD6"/>
+              <w:bottom w:val="single" w:sz="4" w:space="0" w:color="E2DFD6"/>
+              <w:left w:val="single" w:sz="4" w:space="0" w:color="E2DFD6"/>
+              <w:right w:val="single" w:sz="4" w:space="0" w:color="E2DFD6"/>
+            </w:tcBorders>
+          </w:tcPr>
+          <w:p>
+            <w:pPr>
+              <w:jc w:val="left"/>
+            </w:pPr>
+            <w:r>
+              <w:rPr>
+                <w:rFonts w:ascii="Segoe UI" w:hAnsi="Segoe UI"/>
+                <w:color w:val="232820"/>
+                <w:sz w:val="17"/>
+              </w:rPr>
+              <w:t>npx @rmyndharis/antigravity-skills install application-performance-performance-optimization</w:t>
+            </w:r>
+          </w:p>
+        </w:tc>
+        <w:tc>
+          <w:tcPr>
+            <w:tcW w:type="dxa" w:w="3312"/>
+            <w:shd w:fill="F9F8F4"/>
+            <w:tcMar>
+              <w:top w:w="70" w:type="dxa"/>
+              <w:bottom w:w="70" w:type="dxa"/>
+              <w:left w:w="110" w:type="dxa"/>
+              <w:right w:w="110" w:type="dxa"/>
+            </w:tcMar>
+            <w:tcBorders>
+              <w:top w:val="single" w:sz="4" w:space="0" w:color="E2DFD6"/>
+              <w:bottom w:val="single" w:sz="4" w:space="0" w:color="E2DFD6"/>
+              <w:left w:val="single" w:sz="4" w:space="0" w:color="E2DFD6"/>
+              <w:right w:val="single" w:sz="4" w:space="0" w:color="E2DFD6"/>
+            </w:tcBorders>
+          </w:tcPr>
+          <w:p>
+            <w:pPr>
+              <w:jc w:val="left"/>
+            </w:pPr>
+            <w:r>
+              <w:rPr>
+                <w:rFonts w:ascii="Segoe UI" w:hAnsi="Segoe UI"/>
+                <w:color w:val="232820"/>
+                <w:sz w:val="17"/>
+              </w:rPr>
+              <w:t>Optimiza el plan de ejecución de SQL Server, índices espaciales GEOMETRY_GRID y minimiza la latencia de serialización GeoJSON para 15,280 lotes.</w:t>
+            </w:r>
+          </w:p>
+        </w:tc>
+      </w:tr>
+      <w:tr>
+        <w:tc>
+          <w:tcPr>
+            <w:tcW w:type="dxa" w:w="2160"/>
+            <w:shd w:fill="FFFFFF"/>
+            <w:tcMar>
+              <w:top w:w="70" w:type="dxa"/>
+              <w:bottom w:w="70" w:type="dxa"/>
+              <w:left w:w="110" w:type="dxa"/>
+              <w:right w:w="110" w:type="dxa"/>
+            </w:tcMar>
+            <w:tcBorders>
+              <w:top w:val="single" w:sz="4" w:space="0" w:color="E2DFD6"/>
+              <w:bottom w:val="single" w:sz="4" w:space="0" w:color="E2DFD6"/>
+              <w:left w:val="single" w:sz="4" w:space="0" w:color="E2DFD6"/>
+              <w:right w:val="single" w:sz="4" w:space="0" w:color="E2DFD6"/>
+            </w:tcBorders>
+          </w:tcPr>
+          <w:p>
+            <w:pPr>
+              <w:jc w:val="left"/>
+            </w:pPr>
+            <w:r>
+              <w:rPr>
+                <w:rFonts w:ascii="Segoe UI" w:hAnsi="Segoe UI"/>
+                <w:color w:val="232820"/>
+                <w:sz w:val="17"/>
+              </w:rPr>
+              <w:t>database-migration</w:t>
+            </w:r>
+          </w:p>
+        </w:tc>
+        <w:tc>
+          <w:tcPr>
+            <w:tcW w:type="dxa" w:w="1728"/>
+            <w:shd w:fill="FFFFFF"/>
+            <w:tcMar>
+              <w:top w:w="70" w:type="dxa"/>
+              <w:bottom w:w="70" w:type="dxa"/>
+              <w:left w:w="110" w:type="dxa"/>
+              <w:right w:w="110" w:type="dxa"/>
+            </w:tcMar>
+            <w:tcBorders>
+              <w:top w:val="single" w:sz="4" w:space="0" w:color="E2DFD6"/>
+              <w:bottom w:val="single" w:sz="4" w:space="0" w:color="E2DFD6"/>
+              <w:left w:val="single" w:sz="4" w:space="0" w:color="E2DFD6"/>
+              <w:right w:val="single" w:sz="4" w:space="0" w:color="E2DFD6"/>
+            </w:tcBorders>
+          </w:tcPr>
+          <w:p>
+            <w:pPr>
+              <w:jc w:val="left"/>
+            </w:pPr>
+            <w:r>
+              <w:rPr>
+                <w:rFonts w:ascii="Segoe UI" w:hAnsi="Segoe UI"/>
+                <w:color w:val="232820"/>
+                <w:sz w:val="17"/>
+              </w:rPr>
+              <w:t>Base de Datos SQL</w:t>
+            </w:r>
+          </w:p>
+        </w:tc>
+        <w:tc>
+          <w:tcPr>
+            <w:tcW w:type="dxa" w:w="2880"/>
+            <w:shd w:fill="FFFFFF"/>
+            <w:tcMar>
+              <w:top w:w="70" w:type="dxa"/>
+              <w:bottom w:w="70" w:type="dxa"/>
+              <w:left w:w="110" w:type="dxa"/>
+              <w:right w:w="110" w:type="dxa"/>
+            </w:tcMar>
+            <w:tcBorders>
+              <w:top w:val="single" w:sz="4" w:space="0" w:color="E2DFD6"/>
+              <w:bottom w:val="single" w:sz="4" w:space="0" w:color="E2DFD6"/>
+              <w:left w:val="single" w:sz="4" w:space="0" w:color="E2DFD6"/>
+              <w:right w:val="single" w:sz="4" w:space="0" w:color="E2DFD6"/>
+            </w:tcBorders>
+          </w:tcPr>
+          <w:p>
+            <w:pPr>
+              <w:jc w:val="left"/>
+            </w:pPr>
+            <w:r>
+              <w:rPr>
+                <w:rFonts w:ascii="Segoe UI" w:hAnsi="Segoe UI"/>
+                <w:color w:val="232820"/>
+                <w:sz w:val="17"/>
+              </w:rPr>
+              <w:t>npx @rmyndharis/antigravity-skills install database-migration</w:t>
+            </w:r>
+          </w:p>
+        </w:tc>
+        <w:tc>
+          <w:tcPr>
+            <w:tcW w:type="dxa" w:w="3312"/>
+            <w:shd w:fill="FFFFFF"/>
+            <w:tcMar>
+              <w:top w:w="70" w:type="dxa"/>
+              <w:bottom w:w="70" w:type="dxa"/>
+              <w:left w:w="110" w:type="dxa"/>
+              <w:right w:w="110" w:type="dxa"/>
+            </w:tcMar>
+            <w:tcBorders>
+              <w:top w:val="single" w:sz="4" w:space="0" w:color="E2DFD6"/>
+              <w:bottom w:val="single" w:sz="4" w:space="0" w:color="E2DFD6"/>
+              <w:left w:val="single" w:sz="4" w:space="0" w:color="E2DFD6"/>
+              <w:right w:val="single" w:sz="4" w:space="0" w:color="E2DFD6"/>
+            </w:tcBorders>
+          </w:tcPr>
+          <w:p>
+            <w:pPr>
+              <w:jc w:val="left"/>
+            </w:pPr>
+            <w:r>
+              <w:rPr>
+                <w:rFonts w:ascii="Segoe UI" w:hAnsi="Segoe UI"/>
+                <w:color w:val="232820"/>
+                <w:sz w:val="17"/>
+              </w:rPr>
+              <w:t>Garantiza el control de versiones formal de los scripts DDL/DML (ScriptDatabaseV13), asegurando la reproducibilidad íntegra del esquema.</w:t>
+            </w:r>
+          </w:p>
+        </w:tc>
+      </w:tr>
+      <w:tr>
+        <w:tc>
+          <w:tcPr>
+            <w:tcW w:type="dxa" w:w="2160"/>
+            <w:shd w:fill="F9F8F4"/>
+            <w:tcMar>
+              <w:top w:w="70" w:type="dxa"/>
+              <w:bottom w:w="70" w:type="dxa"/>
+              <w:left w:w="110" w:type="dxa"/>
+              <w:right w:w="110" w:type="dxa"/>
+            </w:tcMar>
+            <w:tcBorders>
+              <w:top w:val="single" w:sz="4" w:space="0" w:color="E2DFD6"/>
+              <w:bottom w:val="single" w:sz="4" w:space="0" w:color="E2DFD6"/>
+              <w:left w:val="single" w:sz="4" w:space="0" w:color="E2DFD6"/>
+              <w:right w:val="single" w:sz="4" w:space="0" w:color="E2DFD6"/>
+            </w:tcBorders>
+          </w:tcPr>
+          <w:p>
+            <w:pPr>
+              <w:jc w:val="left"/>
+            </w:pPr>
+            <w:r>
+              <w:rPr>
+                <w:rFonts w:ascii="Segoe UI" w:hAnsi="Segoe UI"/>
+                <w:color w:val="232820"/>
+                <w:sz w:val="17"/>
+              </w:rPr>
+              <w:t>multi-platform-apps-multi-platform</w:t>
+            </w:r>
+          </w:p>
+        </w:tc>
+        <w:tc>
+          <w:tcPr>
+            <w:tcW w:type="dxa" w:w="1728"/>
+            <w:shd w:fill="F9F8F4"/>
+            <w:tcMar>
+              <w:top w:w="70" w:type="dxa"/>
+              <w:bottom w:w="70" w:type="dxa"/>
+              <w:left w:w="110" w:type="dxa"/>
+              <w:right w:w="110" w:type="dxa"/>
+            </w:tcMar>
+            <w:tcBorders>
+              <w:top w:val="single" w:sz="4" w:space="0" w:color="E2DFD6"/>
+              <w:bottom w:val="single" w:sz="4" w:space="0" w:color="E2DFD6"/>
+              <w:left w:val="single" w:sz="4" w:space="0" w:color="E2DFD6"/>
+              <w:right w:val="single" w:sz="4" w:space="0" w:color="E2DFD6"/>
+            </w:tcBorders>
+          </w:tcPr>
+          <w:p>
+            <w:pPr>
+              <w:jc w:val="left"/>
+            </w:pPr>
+            <w:r>
+              <w:rPr>
+                <w:rFonts w:ascii="Segoe UI" w:hAnsi="Segoe UI"/>
+                <w:color w:val="232820"/>
+                <w:sz w:val="17"/>
+              </w:rPr>
+              <w:t>Arquitectura Móvil</w:t>
+            </w:r>
+          </w:p>
+        </w:tc>
+        <w:tc>
+          <w:tcPr>
+            <w:tcW w:type="dxa" w:w="2880"/>
+            <w:shd w:fill="F9F8F4"/>
+            <w:tcMar>
+              <w:top w:w="70" w:type="dxa"/>
+              <w:bottom w:w="70" w:type="dxa"/>
+              <w:left w:w="110" w:type="dxa"/>
+              <w:right w:w="110" w:type="dxa"/>
+            </w:tcMar>
+            <w:tcBorders>
+              <w:top w:val="single" w:sz="4" w:space="0" w:color="E2DFD6"/>
+              <w:bottom w:val="single" w:sz="4" w:space="0" w:color="E2DFD6"/>
+              <w:left w:val="single" w:sz="4" w:space="0" w:color="E2DFD6"/>
+              <w:right w:val="single" w:sz="4" w:space="0" w:color="E2DFD6"/>
+            </w:tcBorders>
+          </w:tcPr>
+          <w:p>
+            <w:pPr>
+              <w:jc w:val="left"/>
+            </w:pPr>
+            <w:r>
+              <w:rPr>
+                <w:rFonts w:ascii="Segoe UI" w:hAnsi="Segoe UI"/>
+                <w:color w:val="232820"/>
+                <w:sz w:val="17"/>
+              </w:rPr>
+              <w:t>npx @rmyndharis/antigravity-skills install multi-platform-apps-multi-platform</w:t>
+            </w:r>
+          </w:p>
+        </w:tc>
+        <w:tc>
+          <w:tcPr>
+            <w:tcW w:type="dxa" w:w="3312"/>
+            <w:shd w:fill="F9F8F4"/>
+            <w:tcMar>
+              <w:top w:w="70" w:type="dxa"/>
+              <w:bottom w:w="70" w:type="dxa"/>
+              <w:left w:w="110" w:type="dxa"/>
+              <w:right w:w="110" w:type="dxa"/>
+            </w:tcMar>
+            <w:tcBorders>
+              <w:top w:val="single" w:sz="4" w:space="0" w:color="E2DFD6"/>
+              <w:bottom w:val="single" w:sz="4" w:space="0" w:color="E2DFD6"/>
+              <w:left w:val="single" w:sz="4" w:space="0" w:color="E2DFD6"/>
+              <w:right w:val="single" w:sz="4" w:space="0" w:color="E2DFD6"/>
+            </w:tcBorders>
+          </w:tcPr>
+          <w:p>
+            <w:pPr>
+              <w:jc w:val="left"/>
+            </w:pPr>
+            <w:r>
+              <w:rPr>
+                <w:rFonts w:ascii="Segoe UI" w:hAnsi="Segoe UI"/>
+                <w:color w:val="232820"/>
+                <w:sz w:val="17"/>
+              </w:rPr>
+              <w:t>Guía la arquitectura multiplataforma web/móvil PWA, asegurando que la experiencia táctil satisfaga el estándar del Anexo F.7 del pliego.</w:t>
+            </w:r>
+          </w:p>
+        </w:tc>
+      </w:tr>
+      <w:tr>
+        <w:tc>
+          <w:tcPr>
+            <w:tcW w:type="dxa" w:w="2160"/>
+            <w:shd w:fill="FFFFFF"/>
+            <w:tcMar>
+              <w:top w:w="70" w:type="dxa"/>
+              <w:bottom w:w="70" w:type="dxa"/>
+              <w:left w:w="110" w:type="dxa"/>
+              <w:right w:w="110" w:type="dxa"/>
+            </w:tcMar>
+            <w:tcBorders>
+              <w:top w:val="single" w:sz="4" w:space="0" w:color="E2DFD6"/>
+              <w:bottom w:val="single" w:sz="4" w:space="0" w:color="E2DFD6"/>
+              <w:left w:val="single" w:sz="4" w:space="0" w:color="E2DFD6"/>
+              <w:right w:val="single" w:sz="4" w:space="0" w:color="E2DFD6"/>
+            </w:tcBorders>
+          </w:tcPr>
+          <w:p>
+            <w:pPr>
+              <w:jc w:val="left"/>
+            </w:pPr>
+            <w:r>
+              <w:rPr>
+                <w:rFonts w:ascii="Segoe UI" w:hAnsi="Segoe UI"/>
+                <w:color w:val="232820"/>
+                <w:sz w:val="17"/>
+              </w:rPr>
+              <w:t>frontend-developer</w:t>
+            </w:r>
+          </w:p>
+        </w:tc>
+        <w:tc>
+          <w:tcPr>
+            <w:tcW w:type="dxa" w:w="1728"/>
+            <w:shd w:fill="FFFFFF"/>
+            <w:tcMar>
+              <w:top w:w="70" w:type="dxa"/>
+              <w:bottom w:w="70" w:type="dxa"/>
+              <w:left w:w="110" w:type="dxa"/>
+              <w:right w:w="110" w:type="dxa"/>
+            </w:tcMar>
+            <w:tcBorders>
+              <w:top w:val="single" w:sz="4" w:space="0" w:color="E2DFD6"/>
+              <w:bottom w:val="single" w:sz="4" w:space="0" w:color="E2DFD6"/>
+              <w:left w:val="single" w:sz="4" w:space="0" w:color="E2DFD6"/>
+              <w:right w:val="single" w:sz="4" w:space="0" w:color="E2DFD6"/>
+            </w:tcBorders>
+          </w:tcPr>
+          <w:p>
+            <w:pPr>
+              <w:jc w:val="left"/>
+            </w:pPr>
+            <w:r>
+              <w:rPr>
+                <w:rFonts w:ascii="Segoe UI" w:hAnsi="Segoe UI"/>
+                <w:color w:val="232820"/>
+                <w:sz w:val="17"/>
+              </w:rPr>
+              <w:t>UI/UX y Leaflet.js</w:t>
+            </w:r>
+          </w:p>
+        </w:tc>
+        <w:tc>
+          <w:tcPr>
+            <w:tcW w:type="dxa" w:w="2880"/>
+            <w:shd w:fill="FFFFFF"/>
+            <w:tcMar>
+              <w:top w:w="70" w:type="dxa"/>
+              <w:bottom w:w="70" w:type="dxa"/>
+              <w:left w:w="110" w:type="dxa"/>
+              <w:right w:w="110" w:type="dxa"/>
+            </w:tcMar>
+            <w:tcBorders>
+              <w:top w:val="single" w:sz="4" w:space="0" w:color="E2DFD6"/>
+              <w:bottom w:val="single" w:sz="4" w:space="0" w:color="E2DFD6"/>
+              <w:left w:val="single" w:sz="4" w:space="0" w:color="E2DFD6"/>
+              <w:right w:val="single" w:sz="4" w:space="0" w:color="E2DFD6"/>
+            </w:tcBorders>
+          </w:tcPr>
+          <w:p>
+            <w:pPr>
+              <w:jc w:val="left"/>
+            </w:pPr>
+            <w:r>
+              <w:rPr>
+                <w:rFonts w:ascii="Segoe UI" w:hAnsi="Segoe UI"/>
+                <w:color w:val="232820"/>
+                <w:sz w:val="17"/>
+              </w:rPr>
+              <w:t>npx @rmyndharis/antigravity-skills install frontend-developer</w:t>
+            </w:r>
+          </w:p>
+        </w:tc>
+        <w:tc>
+          <w:tcPr>
+            <w:tcW w:type="dxa" w:w="3312"/>
+            <w:shd w:fill="FFFFFF"/>
+            <w:tcMar>
+              <w:top w:w="70" w:type="dxa"/>
+              <w:bottom w:w="70" w:type="dxa"/>
+              <w:left w:w="110" w:type="dxa"/>
+              <w:right w:w="110" w:type="dxa"/>
+            </w:tcMar>
+            <w:tcBorders>
+              <w:top w:val="single" w:sz="4" w:space="0" w:color="E2DFD6"/>
+              <w:bottom w:val="single" w:sz="4" w:space="0" w:color="E2DFD6"/>
+              <w:left w:val="single" w:sz="4" w:space="0" w:color="E2DFD6"/>
+              <w:right w:val="single" w:sz="4" w:space="0" w:color="E2DFD6"/>
+            </w:tcBorders>
+          </w:tcPr>
+          <w:p>
+            <w:pPr>
+              <w:jc w:val="left"/>
+            </w:pPr>
+            <w:r>
+              <w:rPr>
+                <w:rFonts w:ascii="Segoe UI" w:hAnsi="Segoe UI"/>
+                <w:color w:val="232820"/>
+                <w:sz w:val="17"/>
+              </w:rPr>
+              <w:t>Optimiza los componentes visuales, el renderizado de capas vectoriales en Leaflet y el diseño corporativo institucional en paleta clara.</w:t>
+            </w:r>
+          </w:p>
+        </w:tc>
+      </w:tr>
+      <w:tr>
+        <w:tc>
+          <w:tcPr>
+            <w:tcW w:type="dxa" w:w="2160"/>
+            <w:shd w:fill="F9F8F4"/>
+            <w:tcMar>
+              <w:top w:w="70" w:type="dxa"/>
+              <w:bottom w:w="70" w:type="dxa"/>
+              <w:left w:w="110" w:type="dxa"/>
+              <w:right w:w="110" w:type="dxa"/>
+            </w:tcMar>
+            <w:tcBorders>
+              <w:top w:val="single" w:sz="4" w:space="0" w:color="E2DFD6"/>
+              <w:bottom w:val="single" w:sz="4" w:space="0" w:color="E2DFD6"/>
+              <w:left w:val="single" w:sz="4" w:space="0" w:color="E2DFD6"/>
+              <w:right w:val="single" w:sz="4" w:space="0" w:color="E2DFD6"/>
+            </w:tcBorders>
+          </w:tcPr>
+          <w:p>
+            <w:pPr>
+              <w:jc w:val="left"/>
+            </w:pPr>
+            <w:r>
+              <w:rPr>
+                <w:rFonts w:ascii="Segoe UI" w:hAnsi="Segoe UI"/>
+                <w:color w:val="232820"/>
+                <w:sz w:val="17"/>
+              </w:rPr>
+              <w:t>frontend-mobile-development-component-scaffold</w:t>
+            </w:r>
+          </w:p>
+        </w:tc>
+        <w:tc>
+          <w:tcPr>
+            <w:tcW w:type="dxa" w:w="1728"/>
+            <w:shd w:fill="F9F8F4"/>
+            <w:tcMar>
+              <w:top w:w="70" w:type="dxa"/>
+              <w:bottom w:w="70" w:type="dxa"/>
+              <w:left w:w="110" w:type="dxa"/>
+              <w:right w:w="110" w:type="dxa"/>
+            </w:tcMar>
+            <w:tcBorders>
+              <w:top w:val="single" w:sz="4" w:space="0" w:color="E2DFD6"/>
+              <w:bottom w:val="single" w:sz="4" w:space="0" w:color="E2DFD6"/>
+              <w:left w:val="single" w:sz="4" w:space="0" w:color="E2DFD6"/>
+              <w:right w:val="single" w:sz="4" w:space="0" w:color="E2DFD6"/>
+            </w:tcBorders>
+          </w:tcPr>
+          <w:p>
+            <w:pPr>
+              <w:jc w:val="left"/>
+            </w:pPr>
+            <w:r>
+              <w:rPr>
+                <w:rFonts w:ascii="Segoe UI" w:hAnsi="Segoe UI"/>
+                <w:color w:val="232820"/>
+                <w:sz w:val="17"/>
+              </w:rPr>
+              <w:t>Componentes Móviles</w:t>
+            </w:r>
+          </w:p>
+        </w:tc>
+        <w:tc>
+          <w:tcPr>
+            <w:tcW w:type="dxa" w:w="2880"/>
+            <w:shd w:fill="F9F8F4"/>
+            <w:tcMar>
+              <w:top w:w="70" w:type="dxa"/>
+              <w:bottom w:w="70" w:type="dxa"/>
+              <w:left w:w="110" w:type="dxa"/>
+              <w:right w:w="110" w:type="dxa"/>
+            </w:tcMar>
+            <w:tcBorders>
+              <w:top w:val="single" w:sz="4" w:space="0" w:color="E2DFD6"/>
+              <w:bottom w:val="single" w:sz="4" w:space="0" w:color="E2DFD6"/>
+              <w:left w:val="single" w:sz="4" w:space="0" w:color="E2DFD6"/>
+              <w:right w:val="single" w:sz="4" w:space="0" w:color="E2DFD6"/>
+            </w:tcBorders>
+          </w:tcPr>
+          <w:p>
+            <w:pPr>
+              <w:jc w:val="left"/>
+            </w:pPr>
+            <w:r>
+              <w:rPr>
+                <w:rFonts w:ascii="Segoe UI" w:hAnsi="Segoe UI"/>
+                <w:color w:val="232820"/>
+                <w:sz w:val="17"/>
+              </w:rPr>
+              <w:t>npx @rmyndharis/antigravity-skills install frontend-mobile-development-component-scaffold</w:t>
+            </w:r>
+          </w:p>
+        </w:tc>
+        <w:tc>
+          <w:tcPr>
+            <w:tcW w:type="dxa" w:w="3312"/>
+            <w:shd w:fill="F9F8F4"/>
+            <w:tcMar>
+              <w:top w:w="70" w:type="dxa"/>
+              <w:bottom w:w="70" w:type="dxa"/>
+              <w:left w:w="110" w:type="dxa"/>
+              <w:right w:w="110" w:type="dxa"/>
+            </w:tcMar>
+            <w:tcBorders>
+              <w:top w:val="single" w:sz="4" w:space="0" w:color="E2DFD6"/>
+              <w:bottom w:val="single" w:sz="4" w:space="0" w:color="E2DFD6"/>
+              <w:left w:val="single" w:sz="4" w:space="0" w:color="E2DFD6"/>
+              <w:right w:val="single" w:sz="4" w:space="0" w:color="E2DFD6"/>
+            </w:tcBorders>
+          </w:tcPr>
+          <w:p>
+            <w:pPr>
+              <w:jc w:val="left"/>
+            </w:pPr>
+            <w:r>
+              <w:rPr>
+                <w:rFonts w:ascii="Segoe UI" w:hAnsi="Segoe UI"/>
+                <w:color w:val="232820"/>
+                <w:sz w:val="17"/>
+              </w:rPr>
+              <w:t>Acelera el andamiaje de hojas inferiores (bottom sheets), menús off-canvas y botones flotantes para inspección catastral táctil.</w:t>
+            </w:r>
+          </w:p>
+        </w:tc>
+      </w:tr>
+      <w:tr>
+        <w:tc>
+          <w:tcPr>
+            <w:tcW w:type="dxa" w:w="2160"/>
+            <w:shd w:fill="FFFFFF"/>
+            <w:tcMar>
+              <w:top w:w="70" w:type="dxa"/>
+              <w:bottom w:w="70" w:type="dxa"/>
+              <w:left w:w="110" w:type="dxa"/>
+              <w:right w:w="110" w:type="dxa"/>
+            </w:tcMar>
+            <w:tcBorders>
+              <w:top w:val="single" w:sz="4" w:space="0" w:color="E2DFD6"/>
+              <w:bottom w:val="single" w:sz="4" w:space="0" w:color="E2DFD6"/>
+              <w:left w:val="single" w:sz="4" w:space="0" w:color="E2DFD6"/>
+              <w:right w:val="single" w:sz="4" w:space="0" w:color="E2DFD6"/>
+            </w:tcBorders>
+          </w:tcPr>
+          <w:p>
+            <w:pPr>
+              <w:jc w:val="left"/>
+            </w:pPr>
+            <w:r>
+              <w:rPr>
+                <w:rFonts w:ascii="Segoe UI" w:hAnsi="Segoe UI"/>
+                <w:color w:val="232820"/>
+                <w:sz w:val="17"/>
+              </w:rPr>
+              <w:t>spec-driven-development</w:t>
+            </w:r>
+          </w:p>
+        </w:tc>
+        <w:tc>
+          <w:tcPr>
+            <w:tcW w:type="dxa" w:w="1728"/>
+            <w:shd w:fill="FFFFFF"/>
+            <w:tcMar>
+              <w:top w:w="70" w:type="dxa"/>
+              <w:bottom w:w="70" w:type="dxa"/>
+              <w:left w:w="110" w:type="dxa"/>
+              <w:right w:w="110" w:type="dxa"/>
+            </w:tcMar>
+            <w:tcBorders>
+              <w:top w:val="single" w:sz="4" w:space="0" w:color="E2DFD6"/>
+              <w:bottom w:val="single" w:sz="4" w:space="0" w:color="E2DFD6"/>
+              <w:left w:val="single" w:sz="4" w:space="0" w:color="E2DFD6"/>
+              <w:right w:val="single" w:sz="4" w:space="0" w:color="E2DFD6"/>
+            </w:tcBorders>
+          </w:tcPr>
+          <w:p>
+            <w:pPr>
+              <w:jc w:val="left"/>
+            </w:pPr>
+            <w:r>
+              <w:rPr>
+                <w:rFonts w:ascii="Segoe UI" w:hAnsi="Segoe UI"/>
+                <w:color w:val="232820"/>
+                <w:sz w:val="17"/>
+              </w:rPr>
+              <w:t>Conformidad Normativa</w:t>
+            </w:r>
+          </w:p>
+        </w:tc>
+        <w:tc>
+          <w:tcPr>
+            <w:tcW w:type="dxa" w:w="2880"/>
+            <w:shd w:fill="FFFFFF"/>
+            <w:tcMar>
+              <w:top w:w="70" w:type="dxa"/>
+              <w:bottom w:w="70" w:type="dxa"/>
+              <w:left w:w="110" w:type="dxa"/>
+              <w:right w:w="110" w:type="dxa"/>
+            </w:tcMar>
+            <w:tcBorders>
+              <w:top w:val="single" w:sz="4" w:space="0" w:color="E2DFD6"/>
+              <w:bottom w:val="single" w:sz="4" w:space="0" w:color="E2DFD6"/>
+              <w:left w:val="single" w:sz="4" w:space="0" w:color="E2DFD6"/>
+              <w:right w:val="single" w:sz="4" w:space="0" w:color="E2DFD6"/>
+            </w:tcBorders>
+          </w:tcPr>
+          <w:p>
+            <w:pPr>
+              <w:jc w:val="left"/>
+            </w:pPr>
+            <w:r>
+              <w:rPr>
+                <w:rFonts w:ascii="Segoe UI" w:hAnsi="Segoe UI"/>
+                <w:color w:val="232820"/>
+                <w:sz w:val="17"/>
+              </w:rPr>
+              <w:t>npx @rmyndharis/antigravity-skills install spec-driven-development</w:t>
+            </w:r>
+          </w:p>
+        </w:tc>
+        <w:tc>
+          <w:tcPr>
+            <w:tcW w:type="dxa" w:w="3312"/>
+            <w:shd w:fill="FFFFFF"/>
+            <w:tcMar>
+              <w:top w:w="70" w:type="dxa"/>
+              <w:bottom w:w="70" w:type="dxa"/>
+              <w:left w:w="110" w:type="dxa"/>
+              <w:right w:w="110" w:type="dxa"/>
+            </w:tcMar>
+            <w:tcBorders>
+              <w:top w:val="single" w:sz="4" w:space="0" w:color="E2DFD6"/>
+              <w:bottom w:val="single" w:sz="4" w:space="0" w:color="E2DFD6"/>
+              <w:left w:val="single" w:sz="4" w:space="0" w:color="E2DFD6"/>
+              <w:right w:val="single" w:sz="4" w:space="0" w:color="E2DFD6"/>
+            </w:tcBorders>
+          </w:tcPr>
+          <w:p>
+            <w:pPr>
+              <w:jc w:val="left"/>
+            </w:pPr>
+            <w:r>
+              <w:rPr>
+                <w:rFonts w:ascii="Segoe UI" w:hAnsi="Segoe UI"/>
+                <w:color w:val="232820"/>
+                <w:sz w:val="17"/>
+              </w:rPr>
+              <w:t>Valida punto por punto el cumplimiento de los requerimientos funcionales, no funcionales y entregables del documento oficial VisorDatosSIG.</w:t>
+            </w:r>
+          </w:p>
+        </w:tc>
+      </w:tr>
+      <w:tr>
+        <w:tc>
+          <w:tcPr>
+            <w:tcW w:type="dxa" w:w="2160"/>
+            <w:shd w:fill="F9F8F4"/>
+            <w:tcMar>
+              <w:top w:w="70" w:type="dxa"/>
+              <w:bottom w:w="70" w:type="dxa"/>
+              <w:left w:w="110" w:type="dxa"/>
+              <w:right w:w="110" w:type="dxa"/>
+            </w:tcMar>
+            <w:tcBorders>
+              <w:top w:val="single" w:sz="4" w:space="0" w:color="E2DFD6"/>
+              <w:bottom w:val="single" w:sz="4" w:space="0" w:color="E2DFD6"/>
+              <w:left w:val="single" w:sz="4" w:space="0" w:color="E2DFD6"/>
+              <w:right w:val="single" w:sz="4" w:space="0" w:color="E2DFD6"/>
+            </w:tcBorders>
+          </w:tcPr>
+          <w:p>
+            <w:pPr>
+              <w:jc w:val="left"/>
+            </w:pPr>
+            <w:r>
+              <w:rPr>
+                <w:rFonts w:ascii="Segoe UI" w:hAnsi="Segoe UI"/>
+                <w:color w:val="232820"/>
+                <w:sz w:val="17"/>
+              </w:rPr>
+              <w:t>security-and-hardening</w:t>
+            </w:r>
+          </w:p>
+        </w:tc>
+        <w:tc>
+          <w:tcPr>
+            <w:tcW w:type="dxa" w:w="1728"/>
+            <w:shd w:fill="F9F8F4"/>
+            <w:tcMar>
+              <w:top w:w="70" w:type="dxa"/>
+              <w:bottom w:w="70" w:type="dxa"/>
+              <w:left w:w="110" w:type="dxa"/>
+              <w:right w:w="110" w:type="dxa"/>
+            </w:tcMar>
+            <w:tcBorders>
+              <w:top w:val="single" w:sz="4" w:space="0" w:color="E2DFD6"/>
+              <w:bottom w:val="single" w:sz="4" w:space="0" w:color="E2DFD6"/>
+              <w:left w:val="single" w:sz="4" w:space="0" w:color="E2DFD6"/>
+              <w:right w:val="single" w:sz="4" w:space="0" w:color="E2DFD6"/>
+            </w:tcBorders>
+          </w:tcPr>
+          <w:p>
+            <w:pPr>
+              <w:jc w:val="left"/>
+            </w:pPr>
+            <w:r>
+              <w:rPr>
+                <w:rFonts w:ascii="Segoe UI" w:hAnsi="Segoe UI"/>
+                <w:color w:val="232820"/>
+                <w:sz w:val="17"/>
+              </w:rPr>
+              <w:t>Seguridad Criptográfica</w:t>
+            </w:r>
+          </w:p>
+        </w:tc>
+        <w:tc>
+          <w:tcPr>
+            <w:tcW w:type="dxa" w:w="2880"/>
+            <w:shd w:fill="F9F8F4"/>
+            <w:tcMar>
+              <w:top w:w="70" w:type="dxa"/>
+              <w:bottom w:w="70" w:type="dxa"/>
+              <w:left w:w="110" w:type="dxa"/>
+              <w:right w:w="110" w:type="dxa"/>
+            </w:tcMar>
+            <w:tcBorders>
+              <w:top w:val="single" w:sz="4" w:space="0" w:color="E2DFD6"/>
+              <w:bottom w:val="single" w:sz="4" w:space="0" w:color="E2DFD6"/>
+              <w:left w:val="single" w:sz="4" w:space="0" w:color="E2DFD6"/>
+              <w:right w:val="single" w:sz="4" w:space="0" w:color="E2DFD6"/>
+            </w:tcBorders>
+          </w:tcPr>
+          <w:p>
+            <w:pPr>
+              <w:jc w:val="left"/>
+            </w:pPr>
+            <w:r>
+              <w:rPr>
+                <w:rFonts w:ascii="Segoe UI" w:hAnsi="Segoe UI"/>
+                <w:color w:val="232820"/>
+                <w:sz w:val="17"/>
+              </w:rPr>
+              <w:t>npx @rmyndharis/antigravity-skills install security-and-hardening</w:t>
+            </w:r>
+          </w:p>
+        </w:tc>
+        <w:tc>
+          <w:tcPr>
+            <w:tcW w:type="dxa" w:w="3312"/>
+            <w:shd w:fill="F9F8F4"/>
+            <w:tcMar>
+              <w:top w:w="70" w:type="dxa"/>
+              <w:bottom w:w="70" w:type="dxa"/>
+              <w:left w:w="110" w:type="dxa"/>
+              <w:right w:w="110" w:type="dxa"/>
+            </w:tcMar>
+            <w:tcBorders>
+              <w:top w:val="single" w:sz="4" w:space="0" w:color="E2DFD6"/>
+              <w:bottom w:val="single" w:sz="4" w:space="0" w:color="E2DFD6"/>
+              <w:left w:val="single" w:sz="4" w:space="0" w:color="E2DFD6"/>
+              <w:right w:val="single" w:sz="4" w:space="0" w:color="E2DFD6"/>
+            </w:tcBorders>
+          </w:tcPr>
+          <w:p>
+            <w:pPr>
+              <w:jc w:val="left"/>
+            </w:pPr>
+            <w:r>
+              <w:rPr>
+                <w:rFonts w:ascii="Segoe UI" w:hAnsi="Segoe UI"/>
+                <w:color w:val="232820"/>
+                <w:sz w:val="17"/>
+              </w:rPr>
+              <w:t>Supervisa la protección de endpoints API contra accesos no autorizados, validación antiforgery y mitigación de vectores de ataque web.</w:t>
+            </w:r>
+          </w:p>
+        </w:tc>
+      </w:tr>
+    </w:tbl>
+    <w:p>
+      <w:pPr>
+        <w:spacing w:before="40" w:after="80"/>
+      </w:pPr>
+    </w:p>
+    <w:p>
+      <w:pPr>
+        <w:keepNext/>
+        <w:spacing w:before="320" w:after="120"/>
+      </w:pPr>
+      <w:r>
+        <w:rPr>
+          <w:rFonts w:ascii="Segoe UI" w:hAnsi="Segoe UI"/>
+          <w:b/>
+          <w:color w:val="1F382B"/>
+          <w:sz w:val="30"/>
+        </w:rPr>
+        <w:t>11. Guía de Instalación, Configuración y Despliegue Local</w:t>
       </w:r>
     </w:p>
     <w:p>
@@ -8983,7 +10985,7 @@
           <w:color w:val="2D302A"/>
           <w:sz w:val="19"/>
         </w:rPr>
-        <w:t>Abrir SSMS y ejecutar en orden: ScriptDatabaseV13\01_CrearBD.sql (crea tablas e índices) y luego los scripts complementarios 04, 05, 06 y 07.</w:t>
+        <w:t>Abrir SSMS y ejecutar en orden: ScriptDatabaseV13\01_CrearBD.sql (crea tablas e índices) y luego los scripts complementarios 04, 05, 06, 07, 08 y 09.</w:t>
       </w:r>
     </w:p>
     <w:p>
@@ -9585,7 +11587,7 @@
           <w:color w:val="1F382B"/>
           <w:sz w:val="30"/>
         </w:rPr>
-        <w:t>11. Conclusiones y Trabajo Futuro</w:t>
+        <w:t>12. Conclusiones y Trabajo Futuro</w:t>
       </w:r>
     </w:p>
     <w:p>

</xml_diff>

<commit_message>
fix(auth): corregir cache en Service Worker, logout robusto e incrustar diagramas UML y DER en documento oficial
</commit_message>
<xml_diff>
--- a/04_Documentacion/VisorDatosSIG_Documento_Tecnico_Oficial.docx
+++ b/04_Documentacion/VisorDatosSIG_Documento_Tecnico_Oficial.docx
@@ -5497,6 +5497,61 @@
     </w:p>
     <w:p>
       <w:pPr>
+        <w:spacing w:before="120" w:after="40"/>
+        <w:jc w:val="center"/>
+      </w:pPr>
+      <w:r>
+        <w:drawing>
+          <wp:inline xmlns:a="http://schemas.openxmlformats.org/drawingml/2006/main" xmlns:pic="http://schemas.openxmlformats.org/drawingml/2006/picture">
+            <wp:extent cx="5669280" cy="3847011"/>
+            <wp:docPr id="2" name="Picture 2"/>
+            <wp:cNvGraphicFramePr>
+              <a:graphicFrameLocks noChangeAspect="1"/>
+            </wp:cNvGraphicFramePr>
+            <a:graphic>
+              <a:graphicData uri="http://schemas.openxmlformats.org/drawingml/2006/picture">
+                <pic:pic>
+                  <pic:nvPicPr>
+                    <pic:cNvPr id="0" name="diagrama_clases_uml.png"/>
+                    <pic:cNvPicPr/>
+                  </pic:nvPicPr>
+                  <pic:blipFill>
+                    <a:blip r:embed="rId12"/>
+                    <a:stretch>
+                      <a:fillRect/>
+                    </a:stretch>
+                  </pic:blipFill>
+                  <pic:spPr>
+                    <a:xfrm>
+                      <a:off x="0" y="0"/>
+                      <a:ext cx="5669280" cy="3847011"/>
+                    </a:xfrm>
+                    <a:prstGeom prst="rect"/>
+                  </pic:spPr>
+                </pic:pic>
+              </a:graphicData>
+            </a:graphic>
+          </wp:inline>
+        </w:drawing>
+      </w:r>
+    </w:p>
+    <w:p>
+      <w:pPr>
+        <w:spacing w:after="160"/>
+        <w:jc w:val="center"/>
+      </w:pPr>
+      <w:r>
+        <w:rPr>
+          <w:rFonts w:ascii="Segoe UI" w:hAnsi="Segoe UI"/>
+          <w:i/>
+          <w:color w:val="64695F"/>
+          <w:sz w:val="16"/>
+        </w:rPr>
+        <w:t>Figura: Diagrama de Clases UML - Arquitectura Limpia en Cuatro Capas (.NET 8.0)</w:t>
+      </w:r>
+    </w:p>
+    <w:p>
+      <w:pPr>
         <w:keepNext/>
         <w:spacing w:before="240" w:after="80"/>
       </w:pPr>
@@ -5580,6 +5635,61 @@
           <w:sz w:val="19"/>
         </w:rPr>
         <w:t>Todas las geometrías se persisten en columnas de tipo nativo 'geometry' de SQL Server con SRID 4326. Se aplicaron índices espaciales GEOMETRY_AUTO_GRID delimitados por el Bounding Box de San Ignacio de Velasco (xmin: -61.05, ymin: -16.45, xmax: -60.85, ymax: -16.30), optimizando las consultas espaciales STContains y STIntersects a menos de 30 milisegundos.</w:t>
+      </w:r>
+    </w:p>
+    <w:p>
+      <w:pPr>
+        <w:spacing w:before="120" w:after="40"/>
+        <w:jc w:val="center"/>
+      </w:pPr>
+      <w:r>
+        <w:drawing>
+          <wp:inline xmlns:a="http://schemas.openxmlformats.org/drawingml/2006/main" xmlns:pic="http://schemas.openxmlformats.org/drawingml/2006/picture">
+            <wp:extent cx="5669280" cy="3847011"/>
+            <wp:docPr id="3" name="Picture 3"/>
+            <wp:cNvGraphicFramePr>
+              <a:graphicFrameLocks noChangeAspect="1"/>
+            </wp:cNvGraphicFramePr>
+            <a:graphic>
+              <a:graphicData uri="http://schemas.openxmlformats.org/drawingml/2006/picture">
+                <pic:pic>
+                  <pic:nvPicPr>
+                    <pic:cNvPr id="0" name="diagrama_entidad_relacion.png"/>
+                    <pic:cNvPicPr/>
+                  </pic:nvPicPr>
+                  <pic:blipFill>
+                    <a:blip r:embed="rId13"/>
+                    <a:stretch>
+                      <a:fillRect/>
+                    </a:stretch>
+                  </pic:blipFill>
+                  <pic:spPr>
+                    <a:xfrm>
+                      <a:off x="0" y="0"/>
+                      <a:ext cx="5669280" cy="3847011"/>
+                    </a:xfrm>
+                    <a:prstGeom prst="rect"/>
+                  </pic:spPr>
+                </pic:pic>
+              </a:graphicData>
+            </a:graphic>
+          </wp:inline>
+        </w:drawing>
+      </w:r>
+    </w:p>
+    <w:p>
+      <w:pPr>
+        <w:spacing w:after="160"/>
+        <w:jc w:val="center"/>
+      </w:pPr>
+      <w:r>
+        <w:rPr>
+          <w:rFonts w:ascii="Segoe UI" w:hAnsi="Segoe UI"/>
+          <w:i/>
+          <w:color w:val="64695F"/>
+          <w:sz w:val="16"/>
+        </w:rPr>
+        <w:t>Figura: Diagrama Entidad-Relación (DER) - Base de Datos Espacial SQL Server 2022 (SRID 4326)</w:t>
       </w:r>
     </w:p>
     <w:p>
@@ -28369,7 +28479,7 @@
         <w:drawing>
           <wp:inline xmlns:a="http://schemas.openxmlformats.org/drawingml/2006/main" xmlns:pic="http://schemas.openxmlformats.org/drawingml/2006/picture">
             <wp:extent cx="5120640" cy="1745218"/>
-            <wp:docPr id="2" name="Picture 2"/>
+            <wp:docPr id="4" name="Picture 4"/>
             <wp:cNvGraphicFramePr>
               <a:graphicFrameLocks noChangeAspect="1"/>
             </wp:cNvGraphicFramePr>
@@ -28381,7 +28491,7 @@
                     <pic:cNvPicPr/>
                   </pic:nvPicPr>
                   <pic:blipFill>
-                    <a:blip r:embed="rId12"/>
+                    <a:blip r:embed="rId14"/>
                     <a:stretch>
                       <a:fillRect/>
                     </a:stretch>
@@ -28447,7 +28557,7 @@
         <w:drawing>
           <wp:inline xmlns:a="http://schemas.openxmlformats.org/drawingml/2006/main" xmlns:pic="http://schemas.openxmlformats.org/drawingml/2006/picture">
             <wp:extent cx="5120640" cy="2688070"/>
-            <wp:docPr id="3" name="Picture 3"/>
+            <wp:docPr id="5" name="Picture 5"/>
             <wp:cNvGraphicFramePr>
               <a:graphicFrameLocks noChangeAspect="1"/>
             </wp:cNvGraphicFramePr>
@@ -28459,7 +28569,7 @@
                     <pic:cNvPicPr/>
                   </pic:nvPicPr>
                   <pic:blipFill>
-                    <a:blip r:embed="rId13"/>
+                    <a:blip r:embed="rId15"/>
                     <a:stretch>
                       <a:fillRect/>
                     </a:stretch>
@@ -28525,7 +28635,7 @@
         <w:drawing>
           <wp:inline xmlns:a="http://schemas.openxmlformats.org/drawingml/2006/main" xmlns:pic="http://schemas.openxmlformats.org/drawingml/2006/picture">
             <wp:extent cx="5120640" cy="2465308"/>
-            <wp:docPr id="4" name="Picture 4"/>
+            <wp:docPr id="6" name="Picture 6"/>
             <wp:cNvGraphicFramePr>
               <a:graphicFrameLocks noChangeAspect="1"/>
             </wp:cNvGraphicFramePr>
@@ -28537,7 +28647,7 @@
                     <pic:cNvPicPr/>
                   </pic:nvPicPr>
                   <pic:blipFill>
-                    <a:blip r:embed="rId14"/>
+                    <a:blip r:embed="rId16"/>
                     <a:stretch>
                       <a:fillRect/>
                     </a:stretch>
@@ -28603,7 +28713,7 @@
         <w:drawing>
           <wp:inline xmlns:a="http://schemas.openxmlformats.org/drawingml/2006/main" xmlns:pic="http://schemas.openxmlformats.org/drawingml/2006/picture">
             <wp:extent cx="5120640" cy="6247181"/>
-            <wp:docPr id="5" name="Picture 5"/>
+            <wp:docPr id="7" name="Picture 7"/>
             <wp:cNvGraphicFramePr>
               <a:graphicFrameLocks noChangeAspect="1"/>
             </wp:cNvGraphicFramePr>
@@ -28615,7 +28725,7 @@
                     <pic:cNvPicPr/>
                   </pic:nvPicPr>
                   <pic:blipFill>
-                    <a:blip r:embed="rId15"/>
+                    <a:blip r:embed="rId17"/>
                     <a:stretch>
                       <a:fillRect/>
                     </a:stretch>

</xml_diff>